<commit_message>
feat: Update design class diagrams and add detailed design views
- Refactor system design class diagram (图4-5) to align with implementation details and clarify design classes.
- Enhance data design class diagram (图4-6) with primary/foreign key annotations and field constraints.
- Introduce new UML diagrams for sequence flows (图4-1 to 图4-4) detailing user interactions and system responses.
- Add detailed design class diagram (图4-7) to provide a comprehensive view of boundary, control, and entity classes.
- Implement unit tests for journey creation request validation and location update request validation.
- Add server executable and software design specification document.
</commit_message>
<xml_diff>
--- a/docs/03_软件需求规格说明书.docx
+++ b/docs/03_软件需求规格说明书.docx
@@ -3228,350 +3228,6 @@
         <w:rPr>
           <w:rFonts w:asciiTheme="minorHAnsi" w:eastAsiaTheme="minorEastAsia" w:hAnsiTheme="minorHAnsi" w:hint="eastAsia"/>
           <w:noProof/>
-          <w:color w:val="000000" w:themeColor="text1"/>
-          <w:sz w:val="22"/>
-          <w:szCs w:val="24"/>
-          <w14:ligatures w14:val="standardContextual"/>
-        </w:rPr>
-      </w:pPr>
-      <w:r>
-        <w:rPr>
-          <w:rStyle w:val="af1"/>
-          <w:noProof/>
-          <w:color w:val="000000" w:themeColor="text1"/>
-          <w:u w:val="none"/>
-        </w:rPr>
-        <w:t>图</w:t>
-      </w:r>
-      <w:r>
-        <w:rPr>
-          <w:rStyle w:val="af1"/>
-          <w:noProof/>
-          <w:color w:val="000000" w:themeColor="text1"/>
-          <w:u w:val="none"/>
-        </w:rPr>
-        <w:t xml:space="preserve">2-2 </w:t>
-      </w:r>
-      <w:r>
-        <w:rPr>
-          <w:rStyle w:val="af1"/>
-          <w:noProof/>
-          <w:color w:val="000000" w:themeColor="text1"/>
-          <w:u w:val="none"/>
-        </w:rPr>
-        <w:t>系统</w:t>
-      </w:r>
-      <w:r>
-        <w:rPr>
-          <w:rStyle w:val="af1"/>
-          <w:noProof/>
-          <w:color w:val="000000" w:themeColor="text1"/>
-          <w:u w:val="none"/>
-        </w:rPr>
-        <w:t>“</w:t>
-      </w:r>
-      <w:r>
-        <w:rPr>
-          <w:rStyle w:val="af1"/>
-          <w:noProof/>
-          <w:color w:val="000000" w:themeColor="text1"/>
-          <w:u w:val="none"/>
-        </w:rPr>
-        <w:t>获取个人行程信息数据</w:t>
-      </w:r>
-      <w:r>
-        <w:rPr>
-          <w:rStyle w:val="af1"/>
-          <w:noProof/>
-          <w:color w:val="000000" w:themeColor="text1"/>
-          <w:u w:val="none"/>
-        </w:rPr>
-        <w:t>”</w:t>
-      </w:r>
-      <w:r>
-        <w:rPr>
-          <w:rStyle w:val="af1"/>
-          <w:noProof/>
-          <w:color w:val="000000" w:themeColor="text1"/>
-          <w:u w:val="none"/>
-        </w:rPr>
-        <w:t>用例顺序图</w:t>
-      </w:r>
-      <w:r>
-        <w:rPr>
-          <w:rStyle w:val="af1"/>
-          <w:noProof/>
-          <w:color w:val="000000" w:themeColor="text1"/>
-          <w:u w:val="none"/>
-        </w:rPr>
-        <w:tab/>
-        <w:t>6</w:t>
-      </w:r>
-    </w:p>
-    <w:p>
-      <w:pPr>
-        <w:pStyle w:val="TOC1"/>
-        <w:rPr>
-          <w:rFonts w:asciiTheme="minorHAnsi" w:eastAsiaTheme="minorEastAsia" w:hAnsiTheme="minorHAnsi" w:hint="eastAsia"/>
-          <w:noProof/>
-          <w:color w:val="000000" w:themeColor="text1"/>
-          <w:sz w:val="22"/>
-          <w:szCs w:val="24"/>
-          <w14:ligatures w14:val="standardContextual"/>
-        </w:rPr>
-      </w:pPr>
-      <w:r>
-        <w:rPr>
-          <w:rStyle w:val="af1"/>
-          <w:noProof/>
-          <w:color w:val="000000" w:themeColor="text1"/>
-          <w:u w:val="none"/>
-        </w:rPr>
-        <w:t>图</w:t>
-      </w:r>
-      <w:r>
-        <w:rPr>
-          <w:rStyle w:val="af1"/>
-          <w:noProof/>
-          <w:color w:val="000000" w:themeColor="text1"/>
-          <w:u w:val="none"/>
-        </w:rPr>
-        <w:t xml:space="preserve">2-3 </w:t>
-      </w:r>
-      <w:r>
-        <w:rPr>
-          <w:rStyle w:val="af1"/>
-          <w:noProof/>
-          <w:color w:val="000000" w:themeColor="text1"/>
-          <w:u w:val="none"/>
-        </w:rPr>
-        <w:t>系统</w:t>
-      </w:r>
-      <w:r>
-        <w:rPr>
-          <w:rStyle w:val="af1"/>
-          <w:noProof/>
-          <w:color w:val="000000" w:themeColor="text1"/>
-          <w:u w:val="none"/>
-        </w:rPr>
-        <w:t>“</w:t>
-      </w:r>
-      <w:r>
-        <w:rPr>
-          <w:rStyle w:val="af1"/>
-          <w:noProof/>
-          <w:color w:val="000000" w:themeColor="text1"/>
-          <w:u w:val="none"/>
-        </w:rPr>
-        <w:t>获取行程安排建议</w:t>
-      </w:r>
-      <w:r>
-        <w:rPr>
-          <w:rStyle w:val="af1"/>
-          <w:noProof/>
-          <w:color w:val="000000" w:themeColor="text1"/>
-          <w:u w:val="none"/>
-        </w:rPr>
-        <w:t>”</w:t>
-      </w:r>
-      <w:r>
-        <w:rPr>
-          <w:rStyle w:val="af1"/>
-          <w:noProof/>
-          <w:color w:val="000000" w:themeColor="text1"/>
-          <w:u w:val="none"/>
-        </w:rPr>
-        <w:t>用例顺序图</w:t>
-      </w:r>
-      <w:r>
-        <w:rPr>
-          <w:rStyle w:val="af1"/>
-          <w:noProof/>
-          <w:color w:val="000000" w:themeColor="text1"/>
-          <w:u w:val="none"/>
-        </w:rPr>
-        <w:tab/>
-        <w:t>7</w:t>
-      </w:r>
-    </w:p>
-    <w:p>
-      <w:pPr>
-        <w:pStyle w:val="TOC1"/>
-        <w:rPr>
-          <w:rFonts w:asciiTheme="minorHAnsi" w:eastAsiaTheme="minorEastAsia" w:hAnsiTheme="minorHAnsi" w:hint="eastAsia"/>
-          <w:noProof/>
-          <w:color w:val="000000" w:themeColor="text1"/>
-          <w:sz w:val="22"/>
-          <w:szCs w:val="24"/>
-          <w14:ligatures w14:val="standardContextual"/>
-        </w:rPr>
-      </w:pPr>
-      <w:r>
-        <w:rPr>
-          <w:rStyle w:val="af1"/>
-          <w:noProof/>
-          <w:color w:val="000000" w:themeColor="text1"/>
-          <w:u w:val="none"/>
-        </w:rPr>
-        <w:t>图</w:t>
-      </w:r>
-      <w:r>
-        <w:rPr>
-          <w:rStyle w:val="af1"/>
-          <w:noProof/>
-          <w:color w:val="000000" w:themeColor="text1"/>
-          <w:u w:val="none"/>
-        </w:rPr>
-        <w:t xml:space="preserve">2-4 </w:t>
-      </w:r>
-      <w:r>
-        <w:rPr>
-          <w:rStyle w:val="af1"/>
-          <w:noProof/>
-          <w:color w:val="000000" w:themeColor="text1"/>
-          <w:u w:val="none"/>
-        </w:rPr>
-        <w:t>系统</w:t>
-      </w:r>
-      <w:r>
-        <w:rPr>
-          <w:rStyle w:val="af1"/>
-          <w:noProof/>
-          <w:color w:val="000000" w:themeColor="text1"/>
-          <w:u w:val="none"/>
-        </w:rPr>
-        <w:t>“</w:t>
-      </w:r>
-      <w:r>
-        <w:rPr>
-          <w:rStyle w:val="af1"/>
-          <w:noProof/>
-          <w:color w:val="000000" w:themeColor="text1"/>
-          <w:u w:val="none"/>
-        </w:rPr>
-        <w:t>获取行程延误风险</w:t>
-      </w:r>
-      <w:r>
-        <w:rPr>
-          <w:rStyle w:val="af1"/>
-          <w:noProof/>
-          <w:color w:val="000000" w:themeColor="text1"/>
-          <w:u w:val="none"/>
-        </w:rPr>
-        <w:t>”</w:t>
-      </w:r>
-      <w:r>
-        <w:rPr>
-          <w:rStyle w:val="af1"/>
-          <w:noProof/>
-          <w:color w:val="000000" w:themeColor="text1"/>
-          <w:u w:val="none"/>
-        </w:rPr>
-        <w:t>用例顺序图</w:t>
-      </w:r>
-      <w:r>
-        <w:rPr>
-          <w:rStyle w:val="af1"/>
-          <w:noProof/>
-          <w:color w:val="000000" w:themeColor="text1"/>
-          <w:u w:val="none"/>
-        </w:rPr>
-        <w:tab/>
-        <w:t>8</w:t>
-      </w:r>
-    </w:p>
-    <w:p>
-      <w:pPr>
-        <w:pStyle w:val="TOC1"/>
-        <w:rPr>
-          <w:rFonts w:asciiTheme="minorHAnsi" w:eastAsiaTheme="minorEastAsia" w:hAnsiTheme="minorHAnsi" w:hint="eastAsia"/>
-          <w:noProof/>
-          <w:color w:val="000000" w:themeColor="text1"/>
-          <w:sz w:val="22"/>
-          <w:szCs w:val="24"/>
-          <w14:ligatures w14:val="standardContextual"/>
-        </w:rPr>
-      </w:pPr>
-      <w:r>
-        <w:rPr>
-          <w:rStyle w:val="af1"/>
-          <w:noProof/>
-          <w:color w:val="000000" w:themeColor="text1"/>
-          <w:u w:val="none"/>
-        </w:rPr>
-        <w:t>图</w:t>
-      </w:r>
-      <w:r>
-        <w:rPr>
-          <w:rStyle w:val="af1"/>
-          <w:noProof/>
-          <w:color w:val="000000" w:themeColor="text1"/>
-          <w:u w:val="none"/>
-        </w:rPr>
-        <w:t xml:space="preserve">2-5 </w:t>
-      </w:r>
-      <w:r>
-        <w:rPr>
-          <w:rStyle w:val="af1"/>
-          <w:noProof/>
-          <w:color w:val="000000" w:themeColor="text1"/>
-          <w:u w:val="none"/>
-        </w:rPr>
-        <w:t>系统</w:t>
-      </w:r>
-      <w:r>
-        <w:rPr>
-          <w:rStyle w:val="af1"/>
-          <w:noProof/>
-          <w:color w:val="000000" w:themeColor="text1"/>
-          <w:u w:val="none"/>
-        </w:rPr>
-        <w:t>“</w:t>
-      </w:r>
-      <w:r>
-        <w:rPr>
-          <w:rStyle w:val="af1"/>
-          <w:noProof/>
-          <w:color w:val="000000" w:themeColor="text1"/>
-          <w:u w:val="none"/>
-        </w:rPr>
-        <w:t>导航到机场</w:t>
-      </w:r>
-      <w:r>
-        <w:rPr>
-          <w:rStyle w:val="af1"/>
-          <w:noProof/>
-          <w:color w:val="000000" w:themeColor="text1"/>
-          <w:u w:val="none"/>
-        </w:rPr>
-        <w:t>”</w:t>
-      </w:r>
-      <w:r>
-        <w:rPr>
-          <w:rStyle w:val="af1"/>
-          <w:noProof/>
-          <w:color w:val="000000" w:themeColor="text1"/>
-          <w:u w:val="none"/>
-        </w:rPr>
-        <w:t>用例顺序图</w:t>
-      </w:r>
-      <w:r>
-        <w:rPr>
-          <w:rStyle w:val="af1"/>
-          <w:noProof/>
-          <w:color w:val="000000" w:themeColor="text1"/>
-          <w:u w:val="none"/>
-        </w:rPr>
-        <w:tab/>
-        <w:t>8</w:t>
-      </w:r>
-    </w:p>
-    <w:p>
-      <w:pPr>
-        <w:pStyle w:val="TOC1"/>
-        <w:rPr>
-          <w:rFonts w:asciiTheme="minorHAnsi" w:eastAsiaTheme="minorEastAsia" w:hAnsiTheme="minorHAnsi" w:hint="eastAsia"/>
-          <w:noProof/>
           <w:sz w:val="22"/>
           <w:szCs w:val="24"/>
           <w14:ligatures w14:val="standardContextual"/>
@@ -4139,6 +3795,7 @@
         <w:rPr>
           <w:rFonts w:hint="eastAsia"/>
         </w:rPr>
+        <w:lastRenderedPageBreak/>
         <w:t>1</w:t>
       </w:r>
       <w:r>
@@ -4172,15 +3829,7 @@
           <w:rFonts w:ascii="仿宋_GB2312" w:eastAsia="仿宋_GB2312" w:hint="eastAsia"/>
           <w:szCs w:val="24"/>
         </w:rPr>
-        <w:t>本软件以民航旅客本人为主要目标用户，包括普通旅客、首次乘机旅客、经常出差的商务旅客、携带儿童或老人出行的旅客以及需要中转或多航段出行的旅客。该类用户需要在出行过程中及时掌握航班、机场、道路交通和自身位置等状态，并据此决定何时出发、先办理哪项手续、是否仍可从容用餐或是否需要联系</w:t>
-      </w:r>
-      <w:r>
-        <w:rPr>
-          <w:rFonts w:ascii="仿宋_GB2312" w:eastAsia="仿宋_GB2312" w:hint="eastAsia"/>
-          <w:szCs w:val="24"/>
-        </w:rPr>
-        <w:lastRenderedPageBreak/>
-        <w:t>航空公司。系统为旅客提供行程状态、风险提示与行动建议，帮助其降低行程的不确定性和误机风险。本系统不面向航空公司、机场等运营管理人员，也不替代航司、机场或空管部门的运行决策。</w:t>
+        <w:t>本软件以民航旅客本人为主要目标用户，包括普通旅客、首次乘机旅客、经常出差的商务旅客、携带儿童或老人出行的旅客以及需要中转或多航段出行的旅客。该类用户需要在出行过程中及时掌握航班、机场、道路交通和自身位置等状态，并据此决定何时出发、先办理哪项手续、是否仍可从容用餐或是否需要联系航空公司。系统为旅客提供行程状态、风险提示与行动建议，帮助其降低行程的不确定性和误机风险。本系统不面向航空公司、机场等运营管理人员，也不替代航司、机场或空管部门的运行决策。</w:t>
       </w:r>
     </w:p>
     <w:p>
@@ -4227,7 +3876,6 @@
         <w:ind w:firstLine="480"/>
         <w:rPr>
           <w:rFonts w:ascii="仿宋_GB2312" w:eastAsia="仿宋_GB2312"/>
-          <w:sz w:val="24"/>
           <w:szCs w:val="24"/>
         </w:rPr>
       </w:pPr>
@@ -4235,7 +3883,6 @@
       <w:r>
         <w:rPr>
           <w:rFonts w:ascii="仿宋_GB2312" w:eastAsia="仿宋_GB2312" w:hint="eastAsia"/>
-          <w:sz w:val="24"/>
           <w:szCs w:val="24"/>
         </w:rPr>
         <w:t>系统围绕“状态感知—行动决策—界面引导”提供五项核心功能，具体功能描述见表1-1。</w:t>
@@ -4552,6 +4199,7 @@
               <w:ind w:firstLine="480"/>
             </w:pPr>
             <w:r>
+              <w:lastRenderedPageBreak/>
               <w:t xml:space="preserve">4. </w:t>
             </w:r>
             <w:r>
@@ -4638,7 +4286,6 @@
         <w:rPr>
           <w:rFonts w:hint="eastAsia"/>
         </w:rPr>
-        <w:lastRenderedPageBreak/>
         <w:t>1</w:t>
       </w:r>
       <w:r>
@@ -4773,6 +4420,7 @@
           <w:rFonts w:eastAsia="仿宋_GB2312" w:cs="Times New Roman"/>
           <w:szCs w:val="24"/>
         </w:rPr>
+        <w:lastRenderedPageBreak/>
         <w:t>Agent</w:t>
       </w:r>
       <w:r>
@@ -4984,7 +4632,6 @@
           <w:rFonts w:ascii="仿宋_GB2312" w:eastAsia="仿宋_GB2312" w:hint="eastAsia"/>
           <w:szCs w:val="24"/>
         </w:rPr>
-        <w:lastRenderedPageBreak/>
         <w:t>[4] 本项目课程汇报材料：基于智能</w:t>
       </w:r>
       <w:r>
@@ -5163,7 +4810,7 @@
     <w:p>
       <w:pPr>
         <w:widowControl/>
-        <w:ind w:firstLine="482"/>
+        <w:ind w:firstLine="480"/>
         <w:jc w:val="left"/>
         <w:rPr>
           <w:rFonts w:ascii="仿宋_GB2312" w:eastAsia="仿宋_GB2312" w:cs="Times New Roman"/>
@@ -5271,21 +4918,7 @@
           <w:rFonts w:ascii="仿宋_GB2312" w:eastAsia="仿宋_GB2312" w:hint="eastAsia"/>
           <w:szCs w:val="24"/>
         </w:rPr>
-        <w:t xml:space="preserve">系统的外部参与者包括旅客和数据来源。旅客直接使用“获取个人行程信息数据”“获取行程安排建议”“获取行程延误风险”和“导航到机场”四个用例；数据来源参与“数据处理分析”用例，为系统提供航班、机场、路线等最新数据。数据处理分析通过 </w:t>
-      </w:r>
-      <w:r>
-        <w:rPr>
-          <w:rFonts w:eastAsia="仿宋_GB2312" w:cs="Times New Roman"/>
-          <w:szCs w:val="24"/>
-        </w:rPr>
-        <w:t>&lt;&lt;extend&gt;&gt;</w:t>
-      </w:r>
-      <w:r>
-        <w:rPr>
-          <w:rFonts w:ascii="仿宋_GB2312" w:eastAsia="仿宋_GB2312" w:hint="eastAsia"/>
-          <w:szCs w:val="24"/>
-        </w:rPr>
-        <w:t xml:space="preserve"> 扩展旅客直接使用的四个用例，行程信息、建议、风险和导航均以经处理的数据为依据。系统用例模型如图2-1所示。</w:t>
+        <w:t>系统的外部参与者包括旅客、数据Agent、建议Agent和数据源。旅客直接使用“创建行程”“查看行程状态与建议”“更新位置或确认所处阶段”和“导航到机场”四个用例；数据Agent、建议Agent和数据源参与“创建行程”“查看行程状态与建议”和“更新位置或确认所处阶段”，其中数据Agent经过数据源获取航班、机场、位置等外部数据并形成统一的行程状态，建议Agent依据行程状态分析旅客所处阶段与延误风险，生成下一步行动建议。系统只提供分析与展示，不自动执行改签、支付等高影响操作。系统用例模型如图2-1所示。</w:t>
       </w:r>
     </w:p>
     <w:p>
@@ -5317,70 +4950,6 @@
           <w:noProof/>
         </w:rPr>
       </w:pPr>
-      <w:r>
-        <w:rPr>
-          <w:rFonts w:hint="eastAsia"/>
-          <w:noProof/>
-        </w:rPr>
-        <mc:AlternateContent>
-          <mc:Choice Requires="wps">
-            <w:drawing>
-              <wp:anchor distT="0" distB="0" distL="114300" distR="114300" simplePos="0" relativeHeight="251660288" behindDoc="0" locked="0" layoutInCell="1" allowOverlap="1" wp14:anchorId="65B1F3CB" wp14:editId="06AFF981">
-                <wp:simplePos x="0" y="0"/>
-                <wp:positionH relativeFrom="column">
-                  <wp:posOffset>3907834</wp:posOffset>
-                </wp:positionH>
-                <wp:positionV relativeFrom="paragraph">
-                  <wp:posOffset>1440114</wp:posOffset>
-                </wp:positionV>
-                <wp:extent cx="274032" cy="415374"/>
-                <wp:effectExtent l="0" t="0" r="31115" b="22860"/>
-                <wp:wrapNone/>
-                <wp:docPr id="1926718266" name="直接连接符 1"/>
-                <wp:cNvGraphicFramePr/>
-                <a:graphic xmlns:a="http://schemas.openxmlformats.org/drawingml/2006/main">
-                  <a:graphicData uri="http://schemas.microsoft.com/office/word/2010/wordprocessingShape">
-                    <wps:wsp>
-                      <wps:cNvCnPr/>
-                      <wps:spPr>
-                        <a:xfrm>
-                          <a:off x="0" y="0"/>
-                          <a:ext cx="274032" cy="415374"/>
-                        </a:xfrm>
-                        <a:prstGeom prst="line">
-                          <a:avLst/>
-                        </a:prstGeom>
-                      </wps:spPr>
-                      <wps:style>
-                        <a:lnRef idx="1">
-                          <a:schemeClr val="accent1"/>
-                        </a:lnRef>
-                        <a:fillRef idx="0">
-                          <a:schemeClr val="accent1"/>
-                        </a:fillRef>
-                        <a:effectRef idx="0">
-                          <a:schemeClr val="accent1"/>
-                        </a:effectRef>
-                        <a:fontRef idx="minor">
-                          <a:schemeClr val="tx1"/>
-                        </a:fontRef>
-                      </wps:style>
-                      <wps:bodyPr/>
-                    </wps:wsp>
-                  </a:graphicData>
-                </a:graphic>
-              </wp:anchor>
-            </w:drawing>
-          </mc:Choice>
-          <mc:Fallback>
-            <w:pict>
-              <v:line w14:anchorId="69E26BEE" id="直接连接符 1" o:spid="_x0000_s1026" style="position:absolute;z-index:251660288;visibility:visible;mso-wrap-style:square;mso-wrap-distance-left:9pt;mso-wrap-distance-top:0;mso-wrap-distance-right:9pt;mso-wrap-distance-bottom:0;mso-position-horizontal:absolute;mso-position-horizontal-relative:text;mso-position-vertical:absolute;mso-position-vertical-relative:text" from="307.7pt,113.4pt" to="329.3pt,146.1pt" o:gfxdata="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" strokecolor="#4472c4 [3204]" strokeweight=".5pt">
-                <v:stroke joinstyle="miter"/>
-              </v:line>
-            </w:pict>
-          </mc:Fallback>
-        </mc:AlternateContent>
-      </w:r>
     </w:p>
     <w:p>
       <w:pPr>
@@ -5391,14 +4960,13 @@
       </w:pPr>
       <w:r>
         <w:rPr>
-          <w:rFonts w:hint="eastAsia"/>
           <w:noProof/>
         </w:rPr>
         <w:drawing>
-          <wp:inline distT="0" distB="0" distL="0" distR="0" wp14:anchorId="3C822A4C" wp14:editId="2DE8F013">
-            <wp:extent cx="4077817" cy="2969703"/>
-            <wp:effectExtent l="0" t="0" r="0" b="2540"/>
-            <wp:docPr id="1770973580" name="图片 1"/>
+          <wp:inline distT="0" distB="0" distL="0" distR="0" wp14:anchorId="3148C8EF" wp14:editId="73EB133D">
+            <wp:extent cx="4150995" cy="3352800"/>
+            <wp:effectExtent l="0" t="0" r="1905" b="0"/>
+            <wp:docPr id="788821099" name="图片 2"/>
             <wp:cNvGraphicFramePr>
               <a:graphicFrameLocks xmlns:a="http://schemas.openxmlformats.org/drawingml/2006/main" noChangeAspect="1"/>
             </wp:cNvGraphicFramePr>
@@ -5411,15 +4979,15 @@
                       <a:picLocks noChangeAspect="1" noChangeArrowheads="1"/>
                     </pic:cNvPicPr>
                   </pic:nvPicPr>
-                  <pic:blipFill rotWithShape="1">
-                    <a:blip r:embed="rId17" cstate="print">
+                  <pic:blipFill>
+                    <a:blip r:embed="rId17">
                       <a:extLst>
                         <a:ext uri="{28A0092B-C50C-407E-A947-70E740481C1C}">
                           <a14:useLocalDpi xmlns:a14="http://schemas.microsoft.com/office/drawing/2010/main" val="0"/>
                         </a:ext>
                       </a:extLst>
                     </a:blip>
-                    <a:srcRect l="3392" t="6563" r="2435" b="9977"/>
+                    <a:srcRect/>
                     <a:stretch>
                       <a:fillRect/>
                     </a:stretch>
@@ -5427,7 +4995,7 @@
                   <pic:spPr bwMode="auto">
                     <a:xfrm>
                       <a:off x="0" y="0"/>
-                      <a:ext cx="4105726" cy="2990028"/>
+                      <a:ext cx="4150995" cy="3352800"/>
                     </a:xfrm>
                     <a:prstGeom prst="rect">
                       <a:avLst/>
@@ -5436,11 +5004,6 @@
                     <a:ln>
                       <a:noFill/>
                     </a:ln>
-                    <a:extLst>
-                      <a:ext uri="{53640926-AAD7-44D8-BBD7-CCE9431645EC}">
-                        <a14:shadowObscured xmlns:a14="http://schemas.microsoft.com/office/drawing/2010/main"/>
-                      </a:ext>
-                    </a:extLst>
                   </pic:spPr>
                 </pic:pic>
               </a:graphicData>
@@ -5525,7 +5088,7 @@
         <w:rPr>
           <w:rFonts w:hint="eastAsia"/>
         </w:rPr>
-        <w:t>软件需求的用例描述及分析顺序图</w:t>
+        <w:t>软件需求的用例描述</w:t>
       </w:r>
       <w:bookmarkEnd w:id="15"/>
     </w:p>
@@ -5543,25 +5106,968 @@
           <w:rFonts w:ascii="仿宋_GB2312" w:eastAsia="仿宋_GB2312" w:hint="eastAsia"/>
           <w:szCs w:val="24"/>
         </w:rPr>
-        <w:t>系统的主要用例包括旅客直接使用的“获取个人行程信息数据”“获取行程安排建议”“获取行程延误风险”“导航到机场”，以及由数据来源参与的“数据处理分析”。数据处理分析是扩展用例，为前四个用例提供数据支撑。本节按用例分别描述业务目标、执行者、触发条件、前置条件、基本交互动作、扩展交互动作及非功能要求；四个旅客用例的顺序图分别见图2-2至图2-5。</w:t>
+        <w:t>系统的主要用例包括旅客直接使用的“创建行程”“查看行程状态与建议”“更新位置或确认所处阶段”和“导航到机场”四个用例。本节按用例分别描述业务目标、执行者、触发条件、前置条件、基本流程、备选流程、后置条件、业务规则、性能需求与可靠性需求。</w:t>
       </w:r>
     </w:p>
     <w:p>
       <w:pPr>
         <w:pStyle w:val="3"/>
       </w:pPr>
+      <w:r>
+        <w:rPr>
+          <w:rFonts w:hint="eastAsia"/>
+        </w:rPr>
+        <w:t xml:space="preserve">2.2.1 </w:t>
+      </w:r>
+      <w:r>
+        <w:rPr>
+          <w:rFonts w:hint="eastAsia"/>
+        </w:rPr>
+        <w:t>用例名：创建行程</w:t>
+      </w:r>
+    </w:p>
+    <w:p>
+      <w:pPr>
+        <w:pStyle w:val="4"/>
+      </w:pPr>
+      <w:r>
+        <w:t xml:space="preserve">2.2.1.1 </w:t>
+      </w:r>
+      <w:r>
+        <w:t>创建行程用例描述</w:t>
+      </w:r>
+    </w:p>
+    <w:p>
+      <w:pPr>
+        <w:ind w:firstLine="480"/>
+        <w:rPr>
+          <w:rFonts w:ascii="仿宋_GB2312" w:eastAsia="仿宋_GB2312" w:cs="Times New Roman"/>
+          <w:szCs w:val="24"/>
+        </w:rPr>
+      </w:pPr>
+      <w:r>
+        <w:rPr>
+          <w:rFonts w:ascii="仿宋_GB2312" w:eastAsia="仿宋_GB2312" w:hint="eastAsia"/>
+          <w:szCs w:val="24"/>
+        </w:rPr>
+        <w:t>业务目标：旅客录入本次出行的航班及行李信息，系统建立行程、识别关键时间节点，并完成对该行程的首次分析。</w:t>
+      </w:r>
+    </w:p>
+    <w:p>
+      <w:pPr>
+        <w:ind w:firstLine="480"/>
+        <w:rPr>
+          <w:rFonts w:ascii="仿宋_GB2312" w:eastAsia="仿宋_GB2312" w:cs="Times New Roman"/>
+          <w:szCs w:val="24"/>
+        </w:rPr>
+      </w:pPr>
+      <w:r>
+        <w:rPr>
+          <w:rFonts w:ascii="仿宋_GB2312" w:eastAsia="仿宋_GB2312" w:hint="eastAsia"/>
+          <w:szCs w:val="24"/>
+        </w:rPr>
+        <w:t>执行者：旅客（发起者）；数据Agent、建议Agent与数据源（参与首次分析）。</w:t>
+      </w:r>
+    </w:p>
+    <w:p>
+      <w:pPr>
+        <w:ind w:firstLine="480"/>
+        <w:rPr>
+          <w:rFonts w:ascii="仿宋_GB2312" w:eastAsia="仿宋_GB2312" w:cs="Times New Roman"/>
+          <w:szCs w:val="24"/>
+        </w:rPr>
+      </w:pPr>
+      <w:r>
+        <w:rPr>
+          <w:rFonts w:ascii="仿宋_GB2312" w:eastAsia="仿宋_GB2312" w:hint="eastAsia"/>
+          <w:szCs w:val="24"/>
+        </w:rPr>
+        <w:t>触发条件：旅客在系统中选择“创建行程”并提交航班信息。</w:t>
+      </w:r>
+    </w:p>
+    <w:p>
+      <w:pPr>
+        <w:ind w:firstLine="480"/>
+        <w:rPr>
+          <w:rFonts w:ascii="仿宋_GB2312" w:eastAsia="仿宋_GB2312" w:cs="Times New Roman"/>
+          <w:szCs w:val="24"/>
+        </w:rPr>
+      </w:pPr>
+      <w:r>
+        <w:rPr>
+          <w:rFonts w:ascii="仿宋_GB2312" w:eastAsia="仿宋_GB2312" w:hint="eastAsia"/>
+          <w:szCs w:val="24"/>
+        </w:rPr>
+        <w:t>前置条件：旅客已掌握拟乘坐航班的航班号、出行日期、出发机场和到达机场；系统服务可用。</w:t>
+      </w:r>
+    </w:p>
+    <w:p>
+      <w:pPr>
+        <w:ind w:firstLine="480"/>
+        <w:rPr>
+          <w:rFonts w:ascii="仿宋_GB2312" w:eastAsia="仿宋_GB2312" w:cs="Times New Roman"/>
+          <w:szCs w:val="24"/>
+        </w:rPr>
+      </w:pPr>
+      <w:r>
+        <w:rPr>
+          <w:rFonts w:ascii="仿宋_GB2312" w:eastAsia="仿宋_GB2312" w:hint="eastAsia"/>
+          <w:szCs w:val="24"/>
+        </w:rPr>
+        <w:t>基本流程：</w:t>
+      </w:r>
+    </w:p>
+    <w:p>
+      <w:pPr>
+        <w:ind w:firstLine="480"/>
+        <w:rPr>
+          <w:rFonts w:ascii="仿宋_GB2312" w:eastAsia="仿宋_GB2312" w:cs="Times New Roman"/>
+          <w:szCs w:val="24"/>
+        </w:rPr>
+      </w:pPr>
+      <w:r>
+        <w:rPr>
+          <w:rFonts w:ascii="仿宋_GB2312" w:eastAsia="仿宋_GB2312" w:hint="eastAsia"/>
+          <w:szCs w:val="24"/>
+        </w:rPr>
+        <w:t>1. 旅客进入系统，选择创建行程，录入航班信息及是否携带托运行李。</w:t>
+      </w:r>
+    </w:p>
+    <w:p>
+      <w:pPr>
+        <w:ind w:firstLine="480"/>
+        <w:rPr>
+          <w:rFonts w:ascii="仿宋_GB2312" w:eastAsia="仿宋_GB2312" w:cs="Times New Roman"/>
+          <w:szCs w:val="24"/>
+        </w:rPr>
+      </w:pPr>
+      <w:r>
+        <w:rPr>
+          <w:rFonts w:ascii="仿宋_GB2312" w:eastAsia="仿宋_GB2312" w:hint="eastAsia"/>
+          <w:szCs w:val="24"/>
+        </w:rPr>
+        <w:t>2. 系统校验录入信息的完整性与有效性。</w:t>
+      </w:r>
+    </w:p>
+    <w:p>
+      <w:pPr>
+        <w:ind w:firstLine="480"/>
+        <w:rPr>
+          <w:rFonts w:ascii="仿宋_GB2312" w:eastAsia="仿宋_GB2312" w:cs="Times New Roman"/>
+          <w:szCs w:val="24"/>
+        </w:rPr>
+      </w:pPr>
+      <w:r>
+        <w:rPr>
+          <w:rFonts w:ascii="仿宋_GB2312" w:eastAsia="仿宋_GB2312" w:hint="eastAsia"/>
+          <w:szCs w:val="24"/>
+        </w:rPr>
+        <w:t>3. 系统建立行程，识别本次出行涉及的值机、安检、登机等关键时间节点。</w:t>
+      </w:r>
+    </w:p>
+    <w:p>
+      <w:pPr>
+        <w:ind w:firstLine="480"/>
+        <w:rPr>
+          <w:rFonts w:ascii="仿宋_GB2312" w:eastAsia="仿宋_GB2312" w:cs="Times New Roman"/>
+          <w:szCs w:val="24"/>
+        </w:rPr>
+      </w:pPr>
+      <w:r>
+        <w:rPr>
+          <w:rFonts w:ascii="仿宋_GB2312" w:eastAsia="仿宋_GB2312" w:hint="eastAsia"/>
+          <w:szCs w:val="24"/>
+        </w:rPr>
+        <w:t>4. 系统触发对该行程的首次分析：数据Agent经过数据源获取航班、机场等外部数据并形成行程状态，建议Agent据此生成初始行动建议与延误风险等级。</w:t>
+      </w:r>
+    </w:p>
+    <w:p>
+      <w:pPr>
+        <w:ind w:firstLine="480"/>
+        <w:rPr>
+          <w:rFonts w:ascii="仿宋_GB2312" w:eastAsia="仿宋_GB2312" w:cs="Times New Roman"/>
+          <w:szCs w:val="24"/>
+        </w:rPr>
+      </w:pPr>
+      <w:r>
+        <w:rPr>
+          <w:rFonts w:ascii="仿宋_GB2312" w:eastAsia="仿宋_GB2312" w:hint="eastAsia"/>
+          <w:szCs w:val="24"/>
+        </w:rPr>
+        <w:lastRenderedPageBreak/>
+        <w:t>5. 系统返回行程创建结果，并进入对该行程的持续监控。</w:t>
+      </w:r>
+    </w:p>
+    <w:p>
+      <w:pPr>
+        <w:ind w:firstLine="480"/>
+        <w:rPr>
+          <w:rFonts w:ascii="仿宋_GB2312" w:eastAsia="仿宋_GB2312" w:cs="Times New Roman"/>
+          <w:szCs w:val="24"/>
+        </w:rPr>
+      </w:pPr>
+      <w:r>
+        <w:rPr>
+          <w:rFonts w:ascii="仿宋_GB2312" w:eastAsia="仿宋_GB2312" w:hint="eastAsia"/>
+          <w:szCs w:val="24"/>
+        </w:rPr>
+        <w:t>备选流程：</w:t>
+      </w:r>
+    </w:p>
+    <w:p>
+      <w:pPr>
+        <w:ind w:firstLine="480"/>
+        <w:rPr>
+          <w:rFonts w:ascii="仿宋_GB2312" w:eastAsia="仿宋_GB2312" w:cs="Times New Roman"/>
+          <w:szCs w:val="24"/>
+        </w:rPr>
+      </w:pPr>
+      <w:r>
+        <w:rPr>
+          <w:rFonts w:ascii="仿宋_GB2312" w:eastAsia="仿宋_GB2312" w:hint="eastAsia"/>
+          <w:szCs w:val="24"/>
+        </w:rPr>
+        <w:t>2a. 录入信息不完整或无效：系统提示旅客修正后返回基本流程第1步。</w:t>
+      </w:r>
+    </w:p>
+    <w:p>
+      <w:pPr>
+        <w:ind w:firstLine="480"/>
+        <w:rPr>
+          <w:rFonts w:ascii="仿宋_GB2312" w:eastAsia="仿宋_GB2312" w:cs="Times New Roman"/>
+          <w:szCs w:val="24"/>
+        </w:rPr>
+      </w:pPr>
+      <w:r>
+        <w:rPr>
+          <w:rFonts w:ascii="仿宋_GB2312" w:eastAsia="仿宋_GB2312" w:hint="eastAsia"/>
+          <w:szCs w:val="24"/>
+        </w:rPr>
+        <w:t>4a. 数据源暂时不可用：系统仍建立行程并展示已获得的信息，同时提示数据待补充。</w:t>
+      </w:r>
+    </w:p>
+    <w:p>
+      <w:pPr>
+        <w:ind w:firstLine="480"/>
+        <w:rPr>
+          <w:rFonts w:ascii="仿宋_GB2312" w:eastAsia="仿宋_GB2312" w:cs="Times New Roman"/>
+          <w:szCs w:val="24"/>
+        </w:rPr>
+      </w:pPr>
+      <w:r>
+        <w:rPr>
+          <w:rFonts w:ascii="仿宋_GB2312" w:eastAsia="仿宋_GB2312" w:hint="eastAsia"/>
+          <w:szCs w:val="24"/>
+        </w:rPr>
+        <w:t>后置条件：系统中存在该旅客的有效行程，并已具备一份状态与建议结果，后续可被持续更新与监控。</w:t>
+      </w:r>
+    </w:p>
+    <w:p>
+      <w:pPr>
+        <w:ind w:firstLine="480"/>
+        <w:rPr>
+          <w:rFonts w:ascii="仿宋_GB2312" w:eastAsia="仿宋_GB2312" w:cs="Times New Roman"/>
+          <w:szCs w:val="24"/>
+        </w:rPr>
+      </w:pPr>
+      <w:r>
+        <w:rPr>
+          <w:rFonts w:ascii="仿宋_GB2312" w:eastAsia="仿宋_GB2312" w:hint="eastAsia"/>
+          <w:szCs w:val="24"/>
+        </w:rPr>
+        <w:t>业务规则：系统只依据有来源的数据建立行程状态，不虚构航班或机场信息；系统不自动执行改签、支付等高影响操作。</w:t>
+      </w:r>
+    </w:p>
+    <w:p>
+      <w:pPr>
+        <w:ind w:firstLine="480"/>
+        <w:rPr>
+          <w:rFonts w:ascii="仿宋_GB2312" w:eastAsia="仿宋_GB2312" w:cs="Times New Roman"/>
+          <w:szCs w:val="24"/>
+        </w:rPr>
+      </w:pPr>
+      <w:r>
+        <w:rPr>
+          <w:rFonts w:ascii="仿宋_GB2312" w:eastAsia="仿宋_GB2312" w:hint="eastAsia"/>
+          <w:szCs w:val="24"/>
+        </w:rPr>
+        <w:t>性能需求：行程创建与信息校验应在可接受时间内完成；外部数据查询应设置超时。</w:t>
+      </w:r>
+    </w:p>
+    <w:p>
+      <w:pPr>
+        <w:ind w:firstLine="480"/>
+        <w:rPr>
+          <w:rFonts w:ascii="仿宋_GB2312" w:eastAsia="仿宋_GB2312" w:cs="Times New Roman"/>
+          <w:szCs w:val="24"/>
+        </w:rPr>
+      </w:pPr>
+      <w:r>
+        <w:rPr>
+          <w:rFonts w:ascii="仿宋_GB2312" w:eastAsia="仿宋_GB2312" w:hint="eastAsia"/>
+          <w:szCs w:val="24"/>
+        </w:rPr>
+        <w:t>可靠性需求：单个数据源失败不应导致行程创建失败，系统应保留已获得的信息并提示数据限制。</w:t>
+      </w:r>
+    </w:p>
+    <w:p>
+      <w:pPr>
+        <w:pStyle w:val="3"/>
+      </w:pPr>
+      <w:r>
+        <w:rPr>
+          <w:rFonts w:hint="eastAsia"/>
+        </w:rPr>
+        <w:t xml:space="preserve">2.2.2 </w:t>
+      </w:r>
+      <w:r>
+        <w:rPr>
+          <w:rFonts w:hint="eastAsia"/>
+        </w:rPr>
+        <w:t>用例名：查看行程状态与建议</w:t>
+      </w:r>
+    </w:p>
+    <w:p>
+      <w:pPr>
+        <w:pStyle w:val="4"/>
+      </w:pPr>
+      <w:r>
+        <w:t xml:space="preserve">2.2.2.1 </w:t>
+      </w:r>
+      <w:r>
+        <w:t>查看行程状态与建议用例描述</w:t>
+      </w:r>
+    </w:p>
+    <w:p>
+      <w:pPr>
+        <w:ind w:firstLine="480"/>
+        <w:rPr>
+          <w:rFonts w:ascii="仿宋_GB2312" w:eastAsia="仿宋_GB2312" w:cs="Times New Roman"/>
+          <w:szCs w:val="24"/>
+        </w:rPr>
+      </w:pPr>
+      <w:r>
+        <w:rPr>
+          <w:rFonts w:ascii="仿宋_GB2312" w:eastAsia="仿宋_GB2312" w:hint="eastAsia"/>
+          <w:szCs w:val="24"/>
+        </w:rPr>
+        <w:t>业务目标：旅客查看当前行程状态、延误风险与下一步行动建议，并了解判断依据、数据来源与更新时间。</w:t>
+      </w:r>
+    </w:p>
+    <w:p>
+      <w:pPr>
+        <w:ind w:firstLine="480"/>
+        <w:rPr>
+          <w:rFonts w:ascii="仿宋_GB2312" w:eastAsia="仿宋_GB2312" w:cs="Times New Roman"/>
+          <w:szCs w:val="24"/>
+        </w:rPr>
+      </w:pPr>
+      <w:r>
+        <w:rPr>
+          <w:rFonts w:ascii="仿宋_GB2312" w:eastAsia="仿宋_GB2312" w:hint="eastAsia"/>
+          <w:szCs w:val="24"/>
+        </w:rPr>
+        <w:t>执行者：旅客（发起者）；数据Agent、建议Agent与数据源（参与数据分析与建议生成）。</w:t>
+      </w:r>
+    </w:p>
+    <w:p>
+      <w:pPr>
+        <w:ind w:firstLine="480"/>
+        <w:rPr>
+          <w:rFonts w:ascii="仿宋_GB2312" w:eastAsia="仿宋_GB2312" w:cs="Times New Roman"/>
+          <w:szCs w:val="24"/>
+        </w:rPr>
+      </w:pPr>
+      <w:r>
+        <w:rPr>
+          <w:rFonts w:ascii="仿宋_GB2312" w:eastAsia="仿宋_GB2312" w:hint="eastAsia"/>
+          <w:szCs w:val="24"/>
+        </w:rPr>
+        <w:t>触发条件：旅客进入行程页面或主动刷新；行程状态发生变化后系统重新分析并更新展示。</w:t>
+      </w:r>
+    </w:p>
+    <w:p>
+      <w:pPr>
+        <w:ind w:firstLine="480"/>
+        <w:rPr>
+          <w:rFonts w:ascii="仿宋_GB2312" w:eastAsia="仿宋_GB2312" w:cs="Times New Roman"/>
+          <w:szCs w:val="24"/>
+        </w:rPr>
+      </w:pPr>
+      <w:r>
+        <w:rPr>
+          <w:rFonts w:ascii="仿宋_GB2312" w:eastAsia="仿宋_GB2312" w:hint="eastAsia"/>
+          <w:szCs w:val="24"/>
+        </w:rPr>
+        <w:lastRenderedPageBreak/>
+        <w:t>前置条件：旅客已创建行程并处于该行程的监控期内；系统可获取数据或已有最近一次有效数据。</w:t>
+      </w:r>
+    </w:p>
+    <w:p>
+      <w:pPr>
+        <w:ind w:firstLine="480"/>
+        <w:rPr>
+          <w:rFonts w:ascii="仿宋_GB2312" w:eastAsia="仿宋_GB2312" w:cs="Times New Roman"/>
+          <w:szCs w:val="24"/>
+        </w:rPr>
+      </w:pPr>
+      <w:r>
+        <w:rPr>
+          <w:rFonts w:ascii="仿宋_GB2312" w:eastAsia="仿宋_GB2312" w:hint="eastAsia"/>
+          <w:szCs w:val="24"/>
+        </w:rPr>
+        <w:t>基本流程：</w:t>
+      </w:r>
+    </w:p>
+    <w:p>
+      <w:pPr>
+        <w:ind w:firstLine="480"/>
+        <w:rPr>
+          <w:rFonts w:ascii="仿宋_GB2312" w:eastAsia="仿宋_GB2312" w:cs="Times New Roman"/>
+          <w:szCs w:val="24"/>
+        </w:rPr>
+      </w:pPr>
+      <w:r>
+        <w:rPr>
+          <w:rFonts w:ascii="仿宋_GB2312" w:eastAsia="仿宋_GB2312" w:hint="eastAsia"/>
+          <w:szCs w:val="24"/>
+        </w:rPr>
+        <w:t>1. 旅客进入行程页面，或主动刷新当前行程状态与建议。</w:t>
+      </w:r>
+    </w:p>
+    <w:p>
+      <w:pPr>
+        <w:ind w:firstLine="480"/>
+        <w:rPr>
+          <w:rFonts w:ascii="仿宋_GB2312" w:eastAsia="仿宋_GB2312" w:cs="Times New Roman"/>
+          <w:szCs w:val="24"/>
+        </w:rPr>
+      </w:pPr>
+      <w:r>
+        <w:rPr>
+          <w:rFonts w:ascii="仿宋_GB2312" w:eastAsia="仿宋_GB2312" w:hint="eastAsia"/>
+          <w:szCs w:val="24"/>
+        </w:rPr>
+        <w:t>2. 系统获取航班状态、机场运行状态、旅客位置及当前时间等数据，并校验数据的时效性与完整性。</w:t>
+      </w:r>
+    </w:p>
+    <w:p>
+      <w:pPr>
+        <w:ind w:firstLine="480"/>
+        <w:rPr>
+          <w:rFonts w:ascii="仿宋_GB2312" w:eastAsia="仿宋_GB2312" w:cs="Times New Roman"/>
+          <w:szCs w:val="24"/>
+        </w:rPr>
+      </w:pPr>
+      <w:r>
+        <w:rPr>
+          <w:rFonts w:ascii="仿宋_GB2312" w:eastAsia="仿宋_GB2312" w:hint="eastAsia"/>
+          <w:szCs w:val="24"/>
+        </w:rPr>
+        <w:t>3. 数据Agent将多源数据整理为统一的当前行程状态，并记录数据来源与更新时间。</w:t>
+      </w:r>
+    </w:p>
+    <w:p>
+      <w:pPr>
+        <w:ind w:firstLine="480"/>
+        <w:rPr>
+          <w:rFonts w:ascii="仿宋_GB2312" w:eastAsia="仿宋_GB2312" w:cs="Times New Roman"/>
+          <w:szCs w:val="24"/>
+        </w:rPr>
+      </w:pPr>
+      <w:r>
+        <w:rPr>
+          <w:rFonts w:ascii="仿宋_GB2312" w:eastAsia="仿宋_GB2312" w:hint="eastAsia"/>
+          <w:szCs w:val="24"/>
+        </w:rPr>
+        <w:t>4. 建议Agent依据当前行程状态判断旅客所处出行阶段，评估旅客能否按时完成值机、安检、候机与登机，得出延误风险等级。</w:t>
+      </w:r>
+    </w:p>
+    <w:p>
+      <w:pPr>
+        <w:ind w:firstLine="480"/>
+        <w:rPr>
+          <w:rFonts w:ascii="仿宋_GB2312" w:eastAsia="仿宋_GB2312" w:cs="Times New Roman"/>
+          <w:szCs w:val="24"/>
+        </w:rPr>
+      </w:pPr>
+      <w:r>
+        <w:rPr>
+          <w:rFonts w:ascii="仿宋_GB2312" w:eastAsia="仿宋_GB2312" w:hint="eastAsia"/>
+          <w:szCs w:val="24"/>
+        </w:rPr>
+        <w:t>5. 建议Agent生成有优先级的下一步行动建议及判断依据。</w:t>
+      </w:r>
+    </w:p>
+    <w:p>
+      <w:pPr>
+        <w:ind w:firstLine="480"/>
+        <w:rPr>
+          <w:rFonts w:ascii="仿宋_GB2312" w:eastAsia="仿宋_GB2312" w:cs="Times New Roman"/>
+          <w:szCs w:val="24"/>
+        </w:rPr>
+      </w:pPr>
+      <w:r>
+        <w:rPr>
+          <w:rFonts w:ascii="仿宋_GB2312" w:eastAsia="仿宋_GB2312" w:hint="eastAsia"/>
+          <w:szCs w:val="24"/>
+        </w:rPr>
+        <w:t>6. 系统在同一页面展示行程状态、时间轴、延误风险等级与行动建议。</w:t>
+      </w:r>
+    </w:p>
+    <w:p>
+      <w:pPr>
+        <w:ind w:firstLine="480"/>
+        <w:rPr>
+          <w:rFonts w:ascii="仿宋_GB2312" w:eastAsia="仿宋_GB2312" w:cs="Times New Roman"/>
+          <w:szCs w:val="24"/>
+        </w:rPr>
+      </w:pPr>
+      <w:r>
+        <w:rPr>
+          <w:rFonts w:ascii="仿宋_GB2312" w:eastAsia="仿宋_GB2312" w:hint="eastAsia"/>
+          <w:szCs w:val="24"/>
+        </w:rPr>
+        <w:t>备选流程：</w:t>
+      </w:r>
+    </w:p>
+    <w:p>
+      <w:pPr>
+        <w:ind w:firstLine="480"/>
+        <w:rPr>
+          <w:rFonts w:ascii="仿宋_GB2312" w:eastAsia="仿宋_GB2312" w:cs="Times New Roman"/>
+          <w:szCs w:val="24"/>
+        </w:rPr>
+      </w:pPr>
+      <w:r>
+        <w:rPr>
+          <w:rFonts w:ascii="仿宋_GB2312" w:eastAsia="仿宋_GB2312" w:hint="eastAsia"/>
+          <w:szCs w:val="24"/>
+        </w:rPr>
+        <w:t>2a. 某数据源暂时不可用：系统以最近一次有效数据为基础继续分析，并标明数据更新时间与降级说明。</w:t>
+      </w:r>
+    </w:p>
+    <w:p>
+      <w:pPr>
+        <w:ind w:firstLine="480"/>
+        <w:rPr>
+          <w:rFonts w:ascii="仿宋_GB2312" w:eastAsia="仿宋_GB2312" w:cs="Times New Roman"/>
+          <w:szCs w:val="24"/>
+        </w:rPr>
+      </w:pPr>
+      <w:r>
+        <w:rPr>
+          <w:rFonts w:ascii="仿宋_GB2312" w:eastAsia="仿宋_GB2312" w:hint="eastAsia"/>
+          <w:szCs w:val="24"/>
+        </w:rPr>
+        <w:t>4a. 判断所依据的关键数据缺失：系统不给出安全结论，风险等级按“未知”或“需注意”处理，并说明数据限制。</w:t>
+      </w:r>
+    </w:p>
+    <w:p>
+      <w:pPr>
+        <w:ind w:firstLine="480"/>
+        <w:rPr>
+          <w:rFonts w:ascii="仿宋_GB2312" w:eastAsia="仿宋_GB2312" w:cs="Times New Roman"/>
+          <w:szCs w:val="24"/>
+        </w:rPr>
+      </w:pPr>
+      <w:r>
+        <w:rPr>
+          <w:rFonts w:ascii="仿宋_GB2312" w:eastAsia="仿宋_GB2312" w:hint="eastAsia"/>
+          <w:szCs w:val="24"/>
+        </w:rPr>
+        <w:t>5a. 分析未能完成：系统保留上一次有效结果，提示分析失败并提供重新分析入口。</w:t>
+      </w:r>
+    </w:p>
+    <w:p>
+      <w:pPr>
+        <w:ind w:firstLine="480"/>
+        <w:rPr>
+          <w:rFonts w:ascii="仿宋_GB2312" w:eastAsia="仿宋_GB2312" w:cs="Times New Roman"/>
+          <w:szCs w:val="24"/>
+        </w:rPr>
+      </w:pPr>
+      <w:r>
+        <w:rPr>
+          <w:rFonts w:ascii="仿宋_GB2312" w:eastAsia="仿宋_GB2312" w:hint="eastAsia"/>
+          <w:szCs w:val="24"/>
+        </w:rPr>
+        <w:t>后置条件：旅客获得一份完整、可解释的当前行程状态与建议；系统保留本次分析结果，供后续查看与更新。</w:t>
+      </w:r>
+    </w:p>
+    <w:p>
+      <w:pPr>
+        <w:ind w:firstLine="480"/>
+        <w:rPr>
+          <w:rFonts w:ascii="仿宋_GB2312" w:eastAsia="仿宋_GB2312" w:cs="Times New Roman"/>
+          <w:szCs w:val="24"/>
+        </w:rPr>
+      </w:pPr>
+      <w:r>
+        <w:rPr>
+          <w:rFonts w:ascii="仿宋_GB2312" w:eastAsia="仿宋_GB2312" w:hint="eastAsia"/>
+          <w:szCs w:val="24"/>
+        </w:rPr>
+        <w:t>业务规则：值机截止、登机截止等关键时间作为硬约束；系统只依据有来源</w:t>
+      </w:r>
+      <w:r>
+        <w:rPr>
+          <w:rFonts w:ascii="仿宋_GB2312" w:eastAsia="仿宋_GB2312" w:hint="eastAsia"/>
+          <w:szCs w:val="24"/>
+        </w:rPr>
+        <w:lastRenderedPageBreak/>
+        <w:t>的数据给出结论，关键数据缺失时不得输出“安全”结论。</w:t>
+      </w:r>
+    </w:p>
+    <w:p>
+      <w:pPr>
+        <w:ind w:firstLine="480"/>
+        <w:rPr>
+          <w:rFonts w:ascii="仿宋_GB2312" w:eastAsia="仿宋_GB2312" w:cs="Times New Roman"/>
+          <w:szCs w:val="24"/>
+        </w:rPr>
+      </w:pPr>
+      <w:r>
+        <w:rPr>
+          <w:rFonts w:ascii="仿宋_GB2312" w:eastAsia="仿宋_GB2312" w:hint="eastAsia"/>
+          <w:szCs w:val="24"/>
+        </w:rPr>
+        <w:t>性能需求：行程状态与建议应在可接受时间内返回；数据变化后应及时重新分析并更新展示。</w:t>
+      </w:r>
+    </w:p>
+    <w:p>
+      <w:pPr>
+        <w:ind w:firstLine="480"/>
+        <w:rPr>
+          <w:rFonts w:ascii="仿宋_GB2312" w:eastAsia="仿宋_GB2312" w:cs="Times New Roman"/>
+          <w:szCs w:val="24"/>
+        </w:rPr>
+      </w:pPr>
+      <w:r>
+        <w:rPr>
+          <w:rFonts w:ascii="仿宋_GB2312" w:eastAsia="仿宋_GB2312" w:hint="eastAsia"/>
+          <w:szCs w:val="24"/>
+        </w:rPr>
+        <w:t>可靠性需求：单个数据源失败不应中断整体分析；建议生成失败时应保留上一次有效结果并给出降级提示。</w:t>
+      </w:r>
+    </w:p>
+    <w:p>
+      <w:pPr>
+        <w:pStyle w:val="3"/>
+      </w:pPr>
+      <w:r>
+        <w:rPr>
+          <w:rFonts w:hint="eastAsia"/>
+        </w:rPr>
+        <w:t xml:space="preserve">2.2.3 </w:t>
+      </w:r>
+      <w:r>
+        <w:rPr>
+          <w:rFonts w:hint="eastAsia"/>
+        </w:rPr>
+        <w:t>用例名：更新位置或确认所处阶段</w:t>
+      </w:r>
+    </w:p>
+    <w:p>
+      <w:pPr>
+        <w:pStyle w:val="4"/>
+      </w:pPr>
+      <w:r>
+        <w:t xml:space="preserve">2.2.3.1 </w:t>
+      </w:r>
+      <w:r>
+        <w:t>更新位置或确认所处阶段用例描述</w:t>
+      </w:r>
+    </w:p>
+    <w:p>
+      <w:pPr>
+        <w:ind w:firstLine="480"/>
+        <w:rPr>
+          <w:rFonts w:ascii="仿宋_GB2312" w:eastAsia="仿宋_GB2312" w:cs="Times New Roman"/>
+          <w:szCs w:val="24"/>
+        </w:rPr>
+      </w:pPr>
+      <w:r>
+        <w:rPr>
+          <w:rFonts w:ascii="仿宋_GB2312" w:eastAsia="仿宋_GB2312" w:hint="eastAsia"/>
+          <w:szCs w:val="24"/>
+        </w:rPr>
+        <w:t>业务目标：旅客更新自己的当前位置，或在定位不可用时手动确认所处阶段，使系统据此更新行程状态与行动建议。</w:t>
+      </w:r>
+    </w:p>
+    <w:p>
+      <w:pPr>
+        <w:ind w:firstLine="480"/>
+        <w:rPr>
+          <w:rFonts w:ascii="仿宋_GB2312" w:eastAsia="仿宋_GB2312" w:cs="Times New Roman"/>
+          <w:szCs w:val="24"/>
+        </w:rPr>
+      </w:pPr>
+      <w:r>
+        <w:rPr>
+          <w:rFonts w:ascii="仿宋_GB2312" w:eastAsia="仿宋_GB2312" w:hint="eastAsia"/>
+          <w:szCs w:val="24"/>
+        </w:rPr>
+        <w:t>执行者：旅客（发起者）；数据Agent、建议Agent与数据源（参与状态更新与分析）。</w:t>
+      </w:r>
+    </w:p>
+    <w:p>
+      <w:pPr>
+        <w:ind w:firstLine="480"/>
+        <w:rPr>
+          <w:rFonts w:ascii="仿宋_GB2312" w:eastAsia="仿宋_GB2312" w:cs="Times New Roman"/>
+          <w:szCs w:val="24"/>
+        </w:rPr>
+      </w:pPr>
+      <w:r>
+        <w:rPr>
+          <w:rFonts w:ascii="仿宋_GB2312" w:eastAsia="仿宋_GB2312" w:hint="eastAsia"/>
+          <w:szCs w:val="24"/>
+        </w:rPr>
+        <w:t>触发条件：旅客在行程页面更新位置或手动确认所处阶段。</w:t>
+      </w:r>
+    </w:p>
+    <w:p>
+      <w:pPr>
+        <w:ind w:firstLine="480"/>
+        <w:rPr>
+          <w:rFonts w:ascii="仿宋_GB2312" w:eastAsia="仿宋_GB2312" w:cs="Times New Roman"/>
+          <w:szCs w:val="24"/>
+        </w:rPr>
+      </w:pPr>
+      <w:r>
+        <w:rPr>
+          <w:rFonts w:ascii="仿宋_GB2312" w:eastAsia="仿宋_GB2312" w:hint="eastAsia"/>
+          <w:szCs w:val="24"/>
+        </w:rPr>
+        <w:t>前置条件：旅客已创建行程并处于该行程的监控期内。</w:t>
+      </w:r>
+    </w:p>
+    <w:p>
+      <w:pPr>
+        <w:ind w:firstLine="480"/>
+        <w:rPr>
+          <w:rFonts w:ascii="仿宋_GB2312" w:eastAsia="仿宋_GB2312" w:cs="Times New Roman"/>
+          <w:szCs w:val="24"/>
+        </w:rPr>
+      </w:pPr>
+      <w:r>
+        <w:rPr>
+          <w:rFonts w:ascii="仿宋_GB2312" w:eastAsia="仿宋_GB2312" w:hint="eastAsia"/>
+          <w:szCs w:val="24"/>
+        </w:rPr>
+        <w:t>基本流程：</w:t>
+      </w:r>
+    </w:p>
+    <w:p>
+      <w:pPr>
+        <w:ind w:firstLine="480"/>
+        <w:rPr>
+          <w:rFonts w:ascii="仿宋_GB2312" w:eastAsia="仿宋_GB2312" w:cs="Times New Roman"/>
+          <w:szCs w:val="24"/>
+        </w:rPr>
+      </w:pPr>
+      <w:r>
+        <w:rPr>
+          <w:rFonts w:ascii="仿宋_GB2312" w:eastAsia="仿宋_GB2312" w:hint="eastAsia"/>
+          <w:szCs w:val="24"/>
+        </w:rPr>
+        <w:t>1. 旅客在行程页面更新自己的当前位置，或手动确认当前所处阶段（前往机场途中、已到机场、值机、安检、候机或登机）。</w:t>
+      </w:r>
+    </w:p>
+    <w:p>
+      <w:pPr>
+        <w:ind w:firstLine="480"/>
+        <w:rPr>
+          <w:rFonts w:ascii="仿宋_GB2312" w:eastAsia="仿宋_GB2312" w:cs="Times New Roman"/>
+          <w:szCs w:val="24"/>
+        </w:rPr>
+      </w:pPr>
+      <w:r>
+        <w:rPr>
+          <w:rFonts w:ascii="仿宋_GB2312" w:eastAsia="仿宋_GB2312" w:hint="eastAsia"/>
+          <w:szCs w:val="24"/>
+        </w:rPr>
+        <w:t>2. 系统接收并记录旅客提供的位置或阶段信息。</w:t>
+      </w:r>
+    </w:p>
+    <w:p>
+      <w:pPr>
+        <w:ind w:firstLine="480"/>
+        <w:rPr>
+          <w:rFonts w:ascii="仿宋_GB2312" w:eastAsia="仿宋_GB2312" w:cs="Times New Roman"/>
+          <w:szCs w:val="24"/>
+        </w:rPr>
+      </w:pPr>
+      <w:r>
+        <w:rPr>
+          <w:rFonts w:ascii="仿宋_GB2312" w:eastAsia="仿宋_GB2312" w:hint="eastAsia"/>
+          <w:szCs w:val="24"/>
+        </w:rPr>
+        <w:t>3. 数据Agent结合最新的旅客状态与航班、机场数据，更新统一的行程状态。</w:t>
+      </w:r>
+    </w:p>
+    <w:p>
+      <w:pPr>
+        <w:ind w:firstLine="480"/>
+        <w:rPr>
+          <w:rFonts w:ascii="仿宋_GB2312" w:eastAsia="仿宋_GB2312" w:cs="Times New Roman"/>
+          <w:szCs w:val="24"/>
+        </w:rPr>
+      </w:pPr>
+      <w:r>
+        <w:rPr>
+          <w:rFonts w:ascii="仿宋_GB2312" w:eastAsia="仿宋_GB2312" w:hint="eastAsia"/>
+          <w:szCs w:val="24"/>
+        </w:rPr>
+        <w:t>4. 建议Agent重新判断旅客所处阶段，评估延误风险，并调整下一步行动建议。</w:t>
+      </w:r>
+    </w:p>
+    <w:p>
+      <w:pPr>
+        <w:ind w:firstLine="480"/>
+        <w:rPr>
+          <w:rFonts w:ascii="仿宋_GB2312" w:eastAsia="仿宋_GB2312" w:cs="Times New Roman"/>
+          <w:szCs w:val="24"/>
+        </w:rPr>
+      </w:pPr>
+      <w:r>
+        <w:rPr>
+          <w:rFonts w:ascii="仿宋_GB2312" w:eastAsia="仿宋_GB2312" w:hint="eastAsia"/>
+          <w:szCs w:val="24"/>
+        </w:rPr>
+        <w:lastRenderedPageBreak/>
+        <w:t>5. 系统向旅客展示更新后的状态、风险等级与行动建议。</w:t>
+      </w:r>
+    </w:p>
+    <w:p>
+      <w:pPr>
+        <w:ind w:firstLine="480"/>
+        <w:rPr>
+          <w:rFonts w:ascii="仿宋_GB2312" w:eastAsia="仿宋_GB2312" w:cs="Times New Roman"/>
+          <w:szCs w:val="24"/>
+        </w:rPr>
+      </w:pPr>
+      <w:r>
+        <w:rPr>
+          <w:rFonts w:ascii="仿宋_GB2312" w:eastAsia="仿宋_GB2312" w:hint="eastAsia"/>
+          <w:szCs w:val="24"/>
+        </w:rPr>
+        <w:t>备选流程：</w:t>
+      </w:r>
+    </w:p>
+    <w:p>
+      <w:pPr>
+        <w:ind w:firstLine="480"/>
+        <w:rPr>
+          <w:rFonts w:ascii="仿宋_GB2312" w:eastAsia="仿宋_GB2312" w:cs="Times New Roman"/>
+          <w:szCs w:val="24"/>
+        </w:rPr>
+      </w:pPr>
+      <w:r>
+        <w:rPr>
+          <w:rFonts w:ascii="仿宋_GB2312" w:eastAsia="仿宋_GB2312" w:hint="eastAsia"/>
+          <w:szCs w:val="24"/>
+        </w:rPr>
+        <w:t>1a. 定位不可用或未获授权：旅客改为手动确认所处阶段，流程继续。</w:t>
+      </w:r>
+    </w:p>
+    <w:p>
+      <w:pPr>
+        <w:ind w:firstLine="480"/>
+        <w:rPr>
+          <w:rFonts w:ascii="仿宋_GB2312" w:eastAsia="仿宋_GB2312" w:cs="Times New Roman"/>
+          <w:szCs w:val="24"/>
+        </w:rPr>
+      </w:pPr>
+      <w:r>
+        <w:rPr>
+          <w:rFonts w:ascii="仿宋_GB2312" w:eastAsia="仿宋_GB2312" w:hint="eastAsia"/>
+          <w:szCs w:val="24"/>
+        </w:rPr>
+        <w:t>3a. 数据源暂时不可用：系统基于最近一次有效数据完成分析，并标注数据限制。</w:t>
+      </w:r>
+    </w:p>
+    <w:p>
+      <w:pPr>
+        <w:ind w:firstLine="480"/>
+        <w:rPr>
+          <w:rFonts w:ascii="仿宋_GB2312" w:eastAsia="仿宋_GB2312" w:cs="Times New Roman"/>
+          <w:szCs w:val="24"/>
+        </w:rPr>
+      </w:pPr>
+      <w:r>
+        <w:rPr>
+          <w:rFonts w:ascii="仿宋_GB2312" w:eastAsia="仿宋_GB2312" w:hint="eastAsia"/>
+          <w:szCs w:val="24"/>
+        </w:rPr>
+        <w:t>后置条件：系统记录旅客的最新位置或阶段，行程状态与行动建议已基于最新旅客状态完成更新。</w:t>
+      </w:r>
+    </w:p>
+    <w:p>
+      <w:pPr>
+        <w:ind w:firstLine="480"/>
+        <w:rPr>
+          <w:rFonts w:ascii="仿宋_GB2312" w:eastAsia="仿宋_GB2312" w:cs="Times New Roman"/>
+          <w:szCs w:val="24"/>
+        </w:rPr>
+      </w:pPr>
+      <w:r>
+        <w:rPr>
+          <w:rFonts w:ascii="仿宋_GB2312" w:eastAsia="仿宋_GB2312" w:hint="eastAsia"/>
+          <w:szCs w:val="24"/>
+        </w:rPr>
+        <w:t>业务规则：系统只依据旅客确认或定位获得的位置信息判断阶段，不自行推断旅客位置；位置更新后应重新分析，不得沿用过期结论。</w:t>
+      </w:r>
+    </w:p>
+    <w:p>
+      <w:pPr>
+        <w:ind w:firstLine="480"/>
+        <w:rPr>
+          <w:rFonts w:ascii="仿宋_GB2312" w:eastAsia="仿宋_GB2312" w:cs="Times New Roman"/>
+          <w:szCs w:val="24"/>
+        </w:rPr>
+      </w:pPr>
+      <w:r>
+        <w:rPr>
+          <w:rFonts w:ascii="仿宋_GB2312" w:eastAsia="仿宋_GB2312" w:hint="eastAsia"/>
+          <w:szCs w:val="24"/>
+        </w:rPr>
+        <w:t>性能需求：位置或阶段更新后，系统应及时重新分析并更新展示结果。</w:t>
+      </w:r>
+    </w:p>
+    <w:p>
+      <w:pPr>
+        <w:ind w:firstLine="480"/>
+        <w:rPr>
+          <w:rFonts w:ascii="仿宋_GB2312" w:eastAsia="仿宋_GB2312" w:cs="Times New Roman"/>
+          <w:szCs w:val="24"/>
+        </w:rPr>
+      </w:pPr>
+      <w:r>
+        <w:rPr>
+          <w:rFonts w:ascii="仿宋_GB2312" w:eastAsia="仿宋_GB2312" w:hint="eastAsia"/>
+          <w:szCs w:val="24"/>
+        </w:rPr>
+        <w:t>可靠性需求：定位失败时系统应提供手动确认阶段的降级方式，不因定位不可用而中断行程监控。</w:t>
+      </w:r>
+    </w:p>
+    <w:p>
+      <w:pPr>
+        <w:pStyle w:val="3"/>
+      </w:pPr>
       <w:bookmarkStart w:id="16" w:name="_Toc239798804"/>
       <w:r>
         <w:rPr>
           <w:rFonts w:hint="eastAsia"/>
         </w:rPr>
-        <w:t xml:space="preserve">2.2.1 </w:t>
+        <w:t xml:space="preserve">2.2.4 </w:t>
       </w:r>
       <w:r>
         <w:rPr>
           <w:rFonts w:hint="eastAsia"/>
         </w:rPr>
-        <w:t>用例名：获取个人行程信息数据</w:t>
+        <w:t>用例名：导航到机场</w:t>
       </w:r>
       <w:bookmarkEnd w:id="16"/>
     </w:p>
@@ -5570,10 +6076,10 @@
         <w:pStyle w:val="4"/>
       </w:pPr>
       <w:r>
-        <w:t xml:space="preserve">2.2.1.1 </w:t>
-      </w:r>
-      <w:r>
-        <w:t>获取个人行程信息数据用例描述</w:t>
+        <w:t xml:space="preserve">2.2.4.1 </w:t>
+      </w:r>
+      <w:r>
+        <w:t>导航到机场用例描述</w:t>
       </w:r>
     </w:p>
     <w:p>
@@ -5589,7 +6095,7 @@
           <w:rFonts w:ascii="仿宋_GB2312" w:eastAsia="仿宋_GB2312" w:hint="eastAsia"/>
           <w:szCs w:val="24"/>
         </w:rPr>
-        <w:t>业务目标：旅客获取当前航班、机场、路线和旅客自身位置等个人行程信息，并了解数据的来源与更新时间。</w:t>
+        <w:t>业务目标：旅客在尚未到达出发机场时，获得由当前行程生成的导航入口，以便前往机场。</w:t>
       </w:r>
     </w:p>
     <w:p>
@@ -5605,7 +6111,7 @@
           <w:rFonts w:ascii="仿宋_GB2312" w:eastAsia="仿宋_GB2312" w:hint="eastAsia"/>
           <w:szCs w:val="24"/>
         </w:rPr>
-        <w:t>执行者：旅客（发起者）；数据来源（通过“数据处理分析”参与）。</w:t>
+        <w:t>执行者：旅客（发起者）；建议Agent（判断是否提供导航入口并生成导航链接）。</w:t>
       </w:r>
     </w:p>
     <w:p>
@@ -5621,7 +6127,7 @@
           <w:rFonts w:ascii="仿宋_GB2312" w:eastAsia="仿宋_GB2312" w:hint="eastAsia"/>
           <w:szCs w:val="24"/>
         </w:rPr>
-        <w:t>触发条件：旅客进入行程页面，或主动刷新个人行程信息。</w:t>
+        <w:t>触发条件：旅客在行程页面选择“前往机场”导航入口。</w:t>
       </w:r>
     </w:p>
     <w:p>
@@ -5637,7 +6143,7 @@
           <w:rFonts w:ascii="仿宋_GB2312" w:eastAsia="仿宋_GB2312" w:hint="eastAsia"/>
           <w:szCs w:val="24"/>
         </w:rPr>
-        <w:t>前置条件：系统服务可用；已存在可查询的行程；数据来源可访问或已有最近一次有效数据。</w:t>
+        <w:t>前置条件：旅客已创建行程；系统判断旅客尚未到达出发机场；已获得当前位置或最近一次有效位置。</w:t>
       </w:r>
     </w:p>
     <w:p>
@@ -5653,7 +6159,8 @@
           <w:rFonts w:ascii="仿宋_GB2312" w:eastAsia="仿宋_GB2312" w:hint="eastAsia"/>
           <w:szCs w:val="24"/>
         </w:rPr>
-        <w:t>基本交互动作：</w:t>
+        <w:lastRenderedPageBreak/>
+        <w:t>基本流程：</w:t>
       </w:r>
     </w:p>
     <w:p>
@@ -5666,286 +6173,314 @@
       </w:pPr>
       <w:r>
         <w:rPr>
+          <w:rFonts w:ascii="仿宋_GB2312" w:eastAsia="仿宋_GB2312" w:hint="eastAsia"/>
+          <w:szCs w:val="24"/>
+        </w:rPr>
+        <w:t>1. 旅客在行程页面选择“前往机场”导航入口。</w:t>
+      </w:r>
+    </w:p>
+    <w:p>
+      <w:pPr>
+        <w:ind w:firstLine="480"/>
+        <w:rPr>
+          <w:rFonts w:ascii="仿宋_GB2312" w:eastAsia="仿宋_GB2312" w:cs="Times New Roman"/>
+          <w:szCs w:val="24"/>
+        </w:rPr>
+      </w:pPr>
+      <w:r>
+        <w:rPr>
+          <w:rFonts w:ascii="仿宋_GB2312" w:eastAsia="仿宋_GB2312" w:hint="eastAsia"/>
+          <w:szCs w:val="24"/>
+        </w:rPr>
+        <w:t>2. 系统根据旅客当前位置与出发机场，生成前往机场的导航链接。</w:t>
+      </w:r>
+    </w:p>
+    <w:p>
+      <w:pPr>
+        <w:ind w:firstLine="480"/>
+        <w:rPr>
+          <w:rFonts w:ascii="仿宋_GB2312" w:eastAsia="仿宋_GB2312" w:cs="Times New Roman"/>
+          <w:szCs w:val="24"/>
+        </w:rPr>
+      </w:pPr>
+      <w:r>
+        <w:rPr>
+          <w:rFonts w:ascii="仿宋_GB2312" w:eastAsia="仿宋_GB2312" w:hint="eastAsia"/>
+          <w:szCs w:val="24"/>
+        </w:rPr>
+        <w:t>3. 旅客点击链接，由旅客自行选择的地图应用或浏览器完成路线导航。</w:t>
+      </w:r>
+    </w:p>
+    <w:p>
+      <w:pPr>
+        <w:ind w:firstLine="480"/>
+        <w:rPr>
+          <w:rFonts w:ascii="仿宋_GB2312" w:eastAsia="仿宋_GB2312" w:cs="Times New Roman"/>
+          <w:szCs w:val="24"/>
+        </w:rPr>
+      </w:pPr>
+      <w:r>
+        <w:rPr>
+          <w:rFonts w:ascii="仿宋_GB2312" w:eastAsia="仿宋_GB2312" w:hint="eastAsia"/>
+          <w:szCs w:val="24"/>
+        </w:rPr>
+        <w:t>4. 旅客返回系统后，可继续查看行程状态与建议。</w:t>
+      </w:r>
+    </w:p>
+    <w:p>
+      <w:pPr>
+        <w:ind w:firstLine="480"/>
+        <w:rPr>
+          <w:rFonts w:ascii="仿宋_GB2312" w:eastAsia="仿宋_GB2312" w:cs="Times New Roman"/>
+          <w:szCs w:val="24"/>
+        </w:rPr>
+      </w:pPr>
+      <w:r>
+        <w:rPr>
+          <w:rFonts w:ascii="仿宋_GB2312" w:eastAsia="仿宋_GB2312" w:hint="eastAsia"/>
+          <w:szCs w:val="24"/>
+        </w:rPr>
+        <w:t>备选流程：</w:t>
+      </w:r>
+    </w:p>
+    <w:p>
+      <w:pPr>
+        <w:ind w:firstLine="480"/>
+        <w:rPr>
+          <w:rFonts w:ascii="仿宋_GB2312" w:eastAsia="仿宋_GB2312" w:cs="Times New Roman"/>
+          <w:szCs w:val="24"/>
+        </w:rPr>
+      </w:pPr>
+      <w:r>
+        <w:rPr>
+          <w:rFonts w:ascii="仿宋_GB2312" w:eastAsia="仿宋_GB2312" w:hint="eastAsia"/>
+          <w:szCs w:val="24"/>
+        </w:rPr>
+        <w:t>1a. 系统判断旅客已到达机场：不提供城市导航入口，改为展示机场内部文字指引。</w:t>
+      </w:r>
+    </w:p>
+    <w:p>
+      <w:pPr>
+        <w:ind w:firstLine="480"/>
+        <w:rPr>
+          <w:rFonts w:ascii="仿宋_GB2312" w:eastAsia="仿宋_GB2312" w:cs="Times New Roman"/>
+          <w:szCs w:val="24"/>
+        </w:rPr>
+      </w:pPr>
+      <w:r>
+        <w:rPr>
+          <w:rFonts w:ascii="仿宋_GB2312" w:eastAsia="仿宋_GB2312" w:hint="eastAsia"/>
+          <w:szCs w:val="24"/>
+        </w:rPr>
+        <w:t>1b. 旅客位置未知：系统提示旅客先更新位置，再提供导航入口。</w:t>
+      </w:r>
+    </w:p>
+    <w:p>
+      <w:pPr>
+        <w:ind w:firstLine="480"/>
+        <w:rPr>
+          <w:rFonts w:ascii="仿宋_GB2312" w:eastAsia="仿宋_GB2312" w:cs="Times New Roman"/>
+          <w:szCs w:val="24"/>
+        </w:rPr>
+      </w:pPr>
+      <w:r>
+        <w:rPr>
+          <w:rFonts w:ascii="仿宋_GB2312" w:eastAsia="仿宋_GB2312" w:hint="eastAsia"/>
+          <w:szCs w:val="24"/>
+        </w:rPr>
+        <w:t>后置条件：旅客获得从当前位置前往出发机场的导航入口，行程监控继续进行。</w:t>
+      </w:r>
+    </w:p>
+    <w:p>
+      <w:pPr>
+        <w:ind w:firstLine="480"/>
+        <w:rPr>
+          <w:rFonts w:ascii="仿宋_GB2312" w:eastAsia="仿宋_GB2312" w:cs="Times New Roman"/>
+          <w:szCs w:val="24"/>
+        </w:rPr>
+      </w:pPr>
+      <w:r>
+        <w:rPr>
+          <w:rFonts w:ascii="仿宋_GB2312" w:eastAsia="仿宋_GB2312" w:hint="eastAsia"/>
+          <w:szCs w:val="24"/>
+        </w:rPr>
+        <w:t>业务规则：导航服务由旅客自行选择的地图应用或浏览器提供；系统只生成并展示导航链接，不执行导航，也不采集行驶轨迹。</w:t>
+      </w:r>
+    </w:p>
+    <w:p>
+      <w:pPr>
+        <w:ind w:firstLine="480"/>
+        <w:rPr>
+          <w:rFonts w:ascii="仿宋_GB2312" w:eastAsia="仿宋_GB2312" w:cs="Times New Roman"/>
+          <w:szCs w:val="24"/>
+        </w:rPr>
+      </w:pPr>
+      <w:r>
+        <w:rPr>
+          <w:rFonts w:ascii="仿宋_GB2312" w:eastAsia="仿宋_GB2312" w:hint="eastAsia"/>
+          <w:szCs w:val="24"/>
+        </w:rPr>
+        <w:t>性能需求：系统生成导航入口应在旅客选择后及时完成。</w:t>
+      </w:r>
+    </w:p>
+    <w:p>
+      <w:pPr>
+        <w:ind w:firstLine="480"/>
+        <w:rPr>
+          <w:rFonts w:ascii="仿宋_GB2312" w:eastAsia="仿宋_GB2312" w:cs="Times New Roman"/>
+          <w:szCs w:val="24"/>
+        </w:rPr>
+      </w:pPr>
+      <w:r>
+        <w:rPr>
+          <w:rFonts w:ascii="仿宋_GB2312" w:eastAsia="仿宋_GB2312" w:hint="eastAsia"/>
+          <w:szCs w:val="24"/>
+        </w:rPr>
+        <w:t>可靠性需求：导航链接不可用时，系统应给出明确提示，且不影响其他行程信息的展示与更新。</w:t>
+      </w:r>
+    </w:p>
+    <w:p>
+      <w:pPr>
+        <w:pStyle w:val="2"/>
+      </w:pPr>
+      <w:bookmarkStart w:id="17" w:name="_Toc239798809"/>
+      <w:r>
+        <w:t>2.</w:t>
+      </w:r>
+      <w:r>
+        <w:t>3</w:t>
+      </w:r>
+      <w:r>
+        <w:t xml:space="preserve"> </w:t>
+      </w:r>
+      <w:r>
+        <w:rPr>
+          <w:rFonts w:hint="eastAsia"/>
+        </w:rPr>
+        <w:t>软件需求的</w:t>
+      </w:r>
+      <w:r>
+        <w:t>分析类图</w:t>
+      </w:r>
+      <w:bookmarkEnd w:id="17"/>
+    </w:p>
+    <w:p>
+      <w:pPr>
+        <w:ind w:firstLine="480"/>
+        <w:rPr>
+          <w:rFonts w:ascii="仿宋_GB2312" w:eastAsia="仿宋_GB2312" w:cs="Times New Roman"/>
+          <w:color w:val="0070C0"/>
+          <w:szCs w:val="24"/>
+        </w:rPr>
+      </w:pPr>
+      <w:r>
+        <w:rPr>
+          <w:rFonts w:ascii="仿宋_GB2312" w:eastAsia="仿宋_GB2312" w:hint="eastAsia"/>
+          <w:szCs w:val="24"/>
+        </w:rPr>
+        <w:t xml:space="preserve">本分析类图将系统划分为边界类、控制类和实体类。边界类为旅客客户端界面，负责创建行程、更新位置、展示行程状态与行动卡片以及跳转地图导航；控制类包括行程服务、数据感知 </w:t>
+      </w:r>
+      <w:r>
+        <w:rPr>
           <w:rFonts w:eastAsia="仿宋_GB2312" w:cs="Times New Roman"/>
           <w:szCs w:val="24"/>
         </w:rPr>
-        <w:t>1.</w:t>
-      </w:r>
-      <w:r>
-        <w:rPr>
-          <w:rFonts w:ascii="仿宋_GB2312" w:eastAsia="仿宋_GB2312" w:hint="eastAsia"/>
-          <w:szCs w:val="24"/>
-        </w:rPr>
-        <w:t xml:space="preserve"> 旅客请求查看个人行程信息（或输入航班号/出行日期请求创建行程）。</w:t>
-      </w:r>
-    </w:p>
-    <w:p>
-      <w:pPr>
-        <w:ind w:firstLine="480"/>
-        <w:rPr>
-          <w:rFonts w:ascii="仿宋_GB2312" w:eastAsia="仿宋_GB2312" w:cs="Times New Roman"/>
-          <w:szCs w:val="24"/>
-        </w:rPr>
-      </w:pPr>
+        <w:t>Agent</w:t>
+      </w:r>
+      <w:r>
+        <w:rPr>
+          <w:rFonts w:ascii="仿宋_GB2312" w:eastAsia="仿宋_GB2312" w:hint="eastAsia"/>
+          <w:szCs w:val="24"/>
+        </w:rPr>
+        <w:t xml:space="preserve">、行动决策 </w:t>
+      </w:r>
       <w:r>
         <w:rPr>
           <w:rFonts w:eastAsia="仿宋_GB2312" w:cs="Times New Roman"/>
           <w:szCs w:val="24"/>
         </w:rPr>
-        <w:t>2.</w:t>
-      </w:r>
-      <w:r>
-        <w:rPr>
-          <w:rFonts w:ascii="仿宋_GB2312" w:eastAsia="仿宋_GB2312" w:hint="eastAsia"/>
-          <w:szCs w:val="24"/>
-        </w:rPr>
-        <w:t xml:space="preserve"> 系统识别当前行程及其涉及的航班、机场、路线和旅客位置。</w:t>
-      </w:r>
-    </w:p>
-    <w:p>
-      <w:pPr>
-        <w:ind w:firstLine="480"/>
-        <w:rPr>
-          <w:rFonts w:ascii="仿宋_GB2312" w:eastAsia="仿宋_GB2312" w:cs="Times New Roman"/>
-          <w:szCs w:val="24"/>
-        </w:rPr>
-      </w:pPr>
+        <w:t>Agent</w:t>
+      </w:r>
+      <w:r>
+        <w:rPr>
+          <w:rFonts w:ascii="仿宋_GB2312" w:eastAsia="仿宋_GB2312" w:hint="eastAsia"/>
+          <w:szCs w:val="24"/>
+        </w:rPr>
+        <w:t xml:space="preserve"> 和实时推送；实体类包括行程、行程状态与行动建议。数据感知</w:t>
+      </w:r>
       <w:r>
         <w:rPr>
           <w:rFonts w:eastAsia="仿宋_GB2312" w:cs="Times New Roman"/>
           <w:szCs w:val="24"/>
         </w:rPr>
-        <w:t>3.</w:t>
-      </w:r>
-      <w:r>
-        <w:rPr>
-          <w:rFonts w:ascii="仿宋_GB2312" w:eastAsia="仿宋_GB2312" w:hint="eastAsia"/>
-          <w:szCs w:val="24"/>
-        </w:rPr>
-        <w:t xml:space="preserve"> 数据处理分析获取并标准化相关数据，记录数据来源与更新时间。</w:t>
-      </w:r>
-    </w:p>
-    <w:p>
-      <w:pPr>
-        <w:ind w:firstLine="480"/>
-        <w:rPr>
-          <w:rFonts w:ascii="仿宋_GB2312" w:eastAsia="仿宋_GB2312" w:cs="Times New Roman"/>
-          <w:szCs w:val="24"/>
-        </w:rPr>
-      </w:pPr>
+        <w:t xml:space="preserve"> Agent</w:t>
+      </w:r>
+      <w:r>
+        <w:rPr>
+          <w:rFonts w:ascii="仿宋_GB2312" w:eastAsia="仿宋_GB2312" w:hint="eastAsia"/>
+          <w:szCs w:val="24"/>
+        </w:rPr>
+        <w:t xml:space="preserve"> 通过数据技能与工具获取航班、</w:t>
+      </w:r>
+      <w:r>
+        <w:rPr>
+          <w:rFonts w:ascii="仿宋_GB2312" w:eastAsia="仿宋_GB2312" w:hint="eastAsia"/>
+          <w:szCs w:val="24"/>
+        </w:rPr>
+        <w:lastRenderedPageBreak/>
+        <w:t>机场和路线数据并生成行程状态；行动决策</w:t>
+      </w:r>
       <w:r>
         <w:rPr>
           <w:rFonts w:eastAsia="仿宋_GB2312" w:cs="Times New Roman"/>
           <w:szCs w:val="24"/>
         </w:rPr>
-        <w:t>4.</w:t>
-      </w:r>
-      <w:r>
-        <w:rPr>
-          <w:rFonts w:ascii="仿宋_GB2312" w:eastAsia="仿宋_GB2312" w:hint="eastAsia"/>
-          <w:szCs w:val="24"/>
-        </w:rPr>
-        <w:t xml:space="preserve"> 系统返回并展示个人行程信息、缺失或降级状态。</w:t>
-      </w:r>
-    </w:p>
-    <w:p>
-      <w:pPr>
-        <w:ind w:firstLine="480"/>
-        <w:rPr>
-          <w:rFonts w:ascii="仿宋_GB2312" w:eastAsia="仿宋_GB2312" w:cs="Times New Roman"/>
-          <w:szCs w:val="24"/>
-        </w:rPr>
-      </w:pPr>
-      <w:r>
-        <w:rPr>
-          <w:rFonts w:ascii="仿宋_GB2312" w:eastAsia="仿宋_GB2312" w:hint="eastAsia"/>
-          <w:szCs w:val="24"/>
-        </w:rPr>
-        <w:t>扩展交互动作：</w:t>
-      </w:r>
-    </w:p>
-    <w:p>
-      <w:pPr>
-        <w:ind w:firstLine="480"/>
-        <w:rPr>
-          <w:rFonts w:ascii="仿宋_GB2312" w:eastAsia="仿宋_GB2312" w:cs="Times New Roman"/>
-          <w:szCs w:val="24"/>
-        </w:rPr>
-      </w:pPr>
+        <w:t xml:space="preserve"> Agent</w:t>
+      </w:r>
+      <w:r>
+        <w:rPr>
+          <w:rFonts w:ascii="仿宋_GB2312" w:eastAsia="仿宋_GB2312" w:hint="eastAsia"/>
+          <w:szCs w:val="24"/>
+        </w:rPr>
+        <w:t xml:space="preserve"> 读取行程状态并生成行动建议；行程状态与行动建议被保存并返回客户端展示。系统分析类图如图</w:t>
+      </w:r>
       <w:r>
         <w:rPr>
           <w:rFonts w:eastAsia="仿宋_GB2312" w:cs="Times New Roman"/>
           <w:szCs w:val="24"/>
         </w:rPr>
-        <w:t>2</w:t>
-      </w:r>
-      <w:r>
-        <w:rPr>
-          <w:rFonts w:eastAsia="仿宋_GB2312" w:cs="Times New Roman"/>
-          <w:szCs w:val="24"/>
-        </w:rPr>
-        <w:t>a</w:t>
-      </w:r>
-      <w:r>
-        <w:rPr>
-          <w:rFonts w:eastAsia="仿宋_GB2312" w:cs="Times New Roman"/>
-          <w:szCs w:val="24"/>
-        </w:rPr>
-        <w:t>1</w:t>
-      </w:r>
-      <w:r>
-        <w:rPr>
-          <w:rFonts w:eastAsia="仿宋_GB2312" w:cs="Times New Roman"/>
-          <w:szCs w:val="24"/>
-        </w:rPr>
-        <w:t>.</w:t>
-      </w:r>
-      <w:r>
-        <w:rPr>
-          <w:rFonts w:ascii="仿宋_GB2312" w:eastAsia="仿宋_GB2312" w:hint="eastAsia"/>
-          <w:szCs w:val="24"/>
-        </w:rPr>
-        <w:t xml:space="preserve"> 数据来源不可用：使用最近一次有效数据并明确标注数据时间和降级状态。</w:t>
-      </w:r>
-    </w:p>
-    <w:p>
-      <w:pPr>
-        <w:ind w:firstLine="480"/>
-        <w:rPr>
-          <w:rFonts w:ascii="仿宋_GB2312" w:eastAsia="仿宋_GB2312" w:cs="Times New Roman"/>
-          <w:szCs w:val="24"/>
-        </w:rPr>
-      </w:pPr>
-      <w:r>
-        <w:rPr>
-          <w:rFonts w:eastAsia="仿宋_GB2312" w:cs="Times New Roman"/>
-          <w:szCs w:val="24"/>
-        </w:rPr>
-        <w:t>2a</w:t>
-      </w:r>
-      <w:r>
-        <w:rPr>
-          <w:rFonts w:eastAsia="仿宋_GB2312" w:cs="Times New Roman"/>
-          <w:szCs w:val="24"/>
-        </w:rPr>
-        <w:t>2</w:t>
-      </w:r>
-      <w:r>
-        <w:rPr>
-          <w:rFonts w:eastAsia="仿宋_GB2312" w:cs="Times New Roman"/>
-          <w:szCs w:val="24"/>
-        </w:rPr>
-        <w:t>.</w:t>
-      </w:r>
-      <w:r>
-        <w:rPr>
-          <w:rFonts w:ascii="仿宋_GB2312" w:eastAsia="仿宋_GB2312" w:hint="eastAsia"/>
-          <w:szCs w:val="24"/>
-        </w:rPr>
-        <w:t xml:space="preserve"> 定位不可用：允许旅客查看已有行程信息，并提示当前定位信息不可用。</w:t>
-      </w:r>
-    </w:p>
-    <w:p>
-      <w:pPr>
-        <w:ind w:firstLine="480"/>
-        <w:rPr>
-          <w:rFonts w:ascii="仿宋_GB2312" w:eastAsia="仿宋_GB2312" w:cs="Times New Roman"/>
-          <w:szCs w:val="24"/>
-        </w:rPr>
-      </w:pPr>
-      <w:r>
-        <w:rPr>
-          <w:rFonts w:ascii="仿宋_GB2312" w:eastAsia="仿宋_GB2312" w:hint="eastAsia"/>
-          <w:szCs w:val="24"/>
-        </w:rPr>
-        <w:t>后置条件：旅客获取到带数据来源、更新时间和有效性的个人行程信息。</w:t>
-      </w:r>
-    </w:p>
-    <w:p>
-      <w:pPr>
-        <w:ind w:firstLine="480"/>
-        <w:rPr>
-          <w:rFonts w:ascii="仿宋_GB2312" w:eastAsia="仿宋_GB2312" w:cs="Times New Roman"/>
-          <w:szCs w:val="24"/>
-        </w:rPr>
-      </w:pPr>
-      <w:r>
-        <w:rPr>
-          <w:rFonts w:ascii="仿宋_GB2312" w:eastAsia="仿宋_GB2312" w:hint="eastAsia"/>
-          <w:szCs w:val="24"/>
-        </w:rPr>
-        <w:t>业务规则：系统只展示有依据的数据，不虚构航班、机场、路线或位置状态。</w:t>
-      </w:r>
-    </w:p>
-    <w:p>
-      <w:pPr>
-        <w:ind w:firstLine="480"/>
-        <w:rPr>
-          <w:rFonts w:ascii="仿宋_GB2312" w:eastAsia="仿宋_GB2312" w:cs="Times New Roman"/>
-          <w:szCs w:val="24"/>
-        </w:rPr>
-      </w:pPr>
-      <w:r>
-        <w:rPr>
-          <w:rFonts w:ascii="仿宋_GB2312" w:eastAsia="仿宋_GB2312" w:hint="eastAsia"/>
-          <w:szCs w:val="24"/>
-        </w:rPr>
-        <w:lastRenderedPageBreak/>
-        <w:t>性能需求：</w:t>
-      </w:r>
-      <w:r>
-        <w:rPr>
-          <w:rFonts w:ascii="仿宋_GB2312" w:eastAsia="仿宋_GB2312"/>
-          <w:szCs w:val="24"/>
-        </w:rPr>
-        <w:t>请求应在可接受时间内返回；外部数据查询应设置超时。</w:t>
-      </w:r>
-    </w:p>
-    <w:p>
-      <w:pPr>
-        <w:ind w:firstLine="480"/>
-        <w:rPr>
-          <w:rFonts w:ascii="仿宋_GB2312" w:eastAsia="仿宋_GB2312" w:cs="Times New Roman"/>
-          <w:szCs w:val="24"/>
-        </w:rPr>
-      </w:pPr>
-      <w:r>
-        <w:rPr>
-          <w:rFonts w:ascii="仿宋_GB2312" w:eastAsia="仿宋_GB2312" w:hint="eastAsia"/>
-          <w:szCs w:val="24"/>
-        </w:rPr>
-        <w:t>可靠性需求：单个数据源失败不影响其他行程信息展示。</w:t>
-      </w:r>
-    </w:p>
-    <w:p>
-      <w:pPr>
-        <w:pStyle w:val="4"/>
-      </w:pPr>
-      <w:r>
-        <w:t xml:space="preserve">2.2.1.2 </w:t>
-      </w:r>
-      <w:r>
-        <w:t>获取个人行程信息数据用例顺序图</w:t>
-      </w:r>
-    </w:p>
-    <w:p>
-      <w:pPr>
-        <w:ind w:firstLine="480"/>
-        <w:rPr>
-          <w:rFonts w:cs="Times New Roman"/>
-          <w:szCs w:val="21"/>
-        </w:rPr>
-      </w:pPr>
-      <w:r>
-        <w:rPr>
-          <w:rFonts w:hint="eastAsia"/>
+        <w:t>2-7</w:t>
+      </w:r>
+      <w:r>
+        <w:rPr>
+          <w:rFonts w:ascii="仿宋_GB2312" w:eastAsia="仿宋_GB2312" w:hint="eastAsia"/>
+          <w:szCs w:val="24"/>
+        </w:rPr>
+        <w:t>所示。</w:t>
+      </w:r>
+    </w:p>
+    <w:p>
+      <w:pPr>
+        <w:keepNext/>
+        <w:spacing w:after="312"/>
+        <w:ind w:firstLine="480"/>
+        <w:jc w:val="center"/>
+      </w:pPr>
+    </w:p>
+    <w:p>
+      <w:pPr>
+        <w:ind w:firstLine="480"/>
+      </w:pPr>
+      <w:bookmarkStart w:id="18" w:name="_Toc239798815"/>
+      <w:r>
+        <w:rPr>
           <w:noProof/>
         </w:rPr>
         <w:drawing>
-          <wp:inline distT="0" distB="0" distL="0" distR="0" wp14:anchorId="0EA41D85" wp14:editId="34F7C02A">
-            <wp:extent cx="5274310" cy="5594985"/>
-            <wp:effectExtent l="0" t="0" r="2540" b="5715"/>
-            <wp:docPr id="1582890289" name="图片 2"/>
+          <wp:inline distT="0" distB="0" distL="0" distR="0" wp14:anchorId="13F4EE17" wp14:editId="4AEEF8ED">
+            <wp:extent cx="5274310" cy="5843905"/>
+            <wp:effectExtent l="0" t="0" r="2540" b="4445"/>
+            <wp:docPr id="90531606" name="图片 1"/>
             <wp:cNvGraphicFramePr>
               <a:graphicFrameLocks xmlns:a="http://schemas.openxmlformats.org/drawingml/2006/main" noChangeAspect="1"/>
             </wp:cNvGraphicFramePr>
@@ -5974,7 +6509,7 @@
                   <pic:spPr bwMode="auto">
                     <a:xfrm>
                       <a:off x="0" y="0"/>
-                      <a:ext cx="5274310" cy="5594985"/>
+                      <a:ext cx="5274310" cy="5843905"/>
                     </a:xfrm>
                     <a:prstGeom prst="rect">
                       <a:avLst/>
@@ -5990,1560 +6525,23 @@
           </wp:inline>
         </w:drawing>
       </w:r>
-    </w:p>
-    <w:p>
-      <w:pPr>
-        <w:pStyle w:val="3"/>
-      </w:pPr>
-      <w:bookmarkStart w:id="17" w:name="_Toc239798805"/>
-      <w:r>
-        <w:t xml:space="preserve">2.2.2 </w:t>
-      </w:r>
-      <w:r>
-        <w:t>用例名：获取行程安排建议</w:t>
-      </w:r>
-      <w:bookmarkEnd w:id="17"/>
-    </w:p>
-    <w:p>
-      <w:pPr>
-        <w:pStyle w:val="4"/>
-      </w:pPr>
-      <w:r>
-        <w:t xml:space="preserve">2.2.2.1 </w:t>
-      </w:r>
-      <w:r>
-        <w:t>获取行程安排建议用例描述</w:t>
-      </w:r>
-    </w:p>
-    <w:p>
-      <w:pPr>
-        <w:ind w:firstLine="480"/>
-        <w:rPr>
-          <w:rFonts w:ascii="仿宋_GB2312" w:eastAsia="仿宋_GB2312" w:cs="Times New Roman"/>
-          <w:szCs w:val="24"/>
-        </w:rPr>
-      </w:pPr>
-      <w:r>
-        <w:rPr>
-          <w:rFonts w:ascii="仿宋_GB2312" w:eastAsia="仿宋_GB2312" w:hint="eastAsia"/>
-          <w:szCs w:val="24"/>
-        </w:rPr>
-        <w:t>业务目标：旅客获取由系统生成的、基于当前行程状态和个人行程信息的下一步行动安排建议。</w:t>
-      </w:r>
-    </w:p>
-    <w:p>
-      <w:pPr>
-        <w:ind w:firstLine="480"/>
-        <w:rPr>
-          <w:rFonts w:ascii="仿宋_GB2312" w:eastAsia="仿宋_GB2312" w:cs="Times New Roman"/>
-          <w:szCs w:val="24"/>
-        </w:rPr>
-      </w:pPr>
-      <w:r>
-        <w:rPr>
-          <w:rFonts w:ascii="仿宋_GB2312" w:eastAsia="仿宋_GB2312" w:hint="eastAsia"/>
-          <w:szCs w:val="24"/>
-        </w:rPr>
-        <w:t>执行者：旅客（发起者）；数据来源（通过“数据处理分析”参与）。</w:t>
-      </w:r>
-    </w:p>
-    <w:p>
-      <w:pPr>
-        <w:ind w:firstLine="480"/>
-        <w:rPr>
-          <w:rFonts w:ascii="仿宋_GB2312" w:eastAsia="仿宋_GB2312" w:cs="Times New Roman"/>
-          <w:szCs w:val="24"/>
-        </w:rPr>
-      </w:pPr>
-      <w:r>
-        <w:rPr>
-          <w:rFonts w:ascii="仿宋_GB2312" w:eastAsia="仿宋_GB2312" w:hint="eastAsia"/>
-          <w:szCs w:val="24"/>
-        </w:rPr>
-        <w:lastRenderedPageBreak/>
-        <w:t>触发条件：旅客查看行程安排建议，或行程状态发生变化后系统重新生成建议。</w:t>
-      </w:r>
-    </w:p>
-    <w:p>
-      <w:pPr>
-        <w:ind w:firstLine="480"/>
-        <w:rPr>
-          <w:rFonts w:ascii="仿宋_GB2312" w:eastAsia="仿宋_GB2312" w:cs="Times New Roman"/>
-          <w:szCs w:val="24"/>
-        </w:rPr>
-      </w:pPr>
-      <w:r>
-        <w:rPr>
-          <w:rFonts w:ascii="仿宋_GB2312" w:eastAsia="仿宋_GB2312" w:hint="eastAsia"/>
-          <w:szCs w:val="24"/>
-        </w:rPr>
-        <w:t>前置条件：已获取个人行程信息；数据来源可用或已有最近一次有效数据。</w:t>
-      </w:r>
-    </w:p>
-    <w:p>
-      <w:pPr>
-        <w:ind w:firstLine="480"/>
-        <w:rPr>
-          <w:rFonts w:ascii="仿宋_GB2312" w:eastAsia="仿宋_GB2312" w:cs="Times New Roman"/>
-          <w:szCs w:val="24"/>
-        </w:rPr>
-      </w:pPr>
-      <w:r>
-        <w:rPr>
-          <w:rFonts w:ascii="仿宋_GB2312" w:eastAsia="仿宋_GB2312" w:hint="eastAsia"/>
-          <w:szCs w:val="24"/>
-        </w:rPr>
-        <w:t>基本交互动作：</w:t>
-      </w:r>
-    </w:p>
-    <w:p>
-      <w:pPr>
-        <w:ind w:firstLine="480"/>
-        <w:rPr>
-          <w:rFonts w:ascii="仿宋_GB2312" w:eastAsia="仿宋_GB2312" w:cs="Times New Roman"/>
-          <w:szCs w:val="24"/>
-        </w:rPr>
-      </w:pPr>
-      <w:r>
-        <w:rPr>
-          <w:rFonts w:eastAsia="仿宋_GB2312" w:cs="Times New Roman"/>
-          <w:szCs w:val="24"/>
-        </w:rPr>
-        <w:t>1.</w:t>
-      </w:r>
-      <w:r>
-        <w:rPr>
-          <w:rFonts w:ascii="仿宋_GB2312" w:eastAsia="仿宋_GB2312" w:hint="eastAsia"/>
-          <w:szCs w:val="24"/>
-        </w:rPr>
-        <w:t xml:space="preserve"> 旅客请求获取行程安排建议。</w:t>
-      </w:r>
-    </w:p>
-    <w:p>
-      <w:pPr>
-        <w:ind w:firstLine="480"/>
-        <w:rPr>
-          <w:rFonts w:ascii="仿宋_GB2312" w:eastAsia="仿宋_GB2312" w:cs="Times New Roman"/>
-          <w:szCs w:val="24"/>
-        </w:rPr>
-      </w:pPr>
-      <w:r>
-        <w:rPr>
-          <w:rFonts w:eastAsia="仿宋_GB2312" w:cs="Times New Roman"/>
-          <w:szCs w:val="24"/>
-        </w:rPr>
-        <w:t>2.</w:t>
-      </w:r>
-      <w:r>
-        <w:rPr>
-          <w:rFonts w:ascii="仿宋_GB2312" w:eastAsia="仿宋_GB2312" w:hint="eastAsia"/>
-          <w:szCs w:val="24"/>
-        </w:rPr>
-        <w:t xml:space="preserve"> 系统读取当前行程信息与数据处理分析结果。</w:t>
-      </w:r>
-    </w:p>
-    <w:p>
-      <w:pPr>
-        <w:ind w:firstLine="480"/>
-        <w:rPr>
-          <w:rFonts w:ascii="仿宋_GB2312" w:eastAsia="仿宋_GB2312" w:cs="Times New Roman"/>
-          <w:szCs w:val="24"/>
-        </w:rPr>
-      </w:pPr>
-      <w:r>
-        <w:rPr>
-          <w:rFonts w:eastAsia="仿宋_GB2312" w:cs="Times New Roman"/>
-          <w:szCs w:val="24"/>
-        </w:rPr>
-        <w:t>3.</w:t>
-      </w:r>
-      <w:r>
-        <w:rPr>
-          <w:rFonts w:ascii="仿宋_GB2312" w:eastAsia="仿宋_GB2312" w:hint="eastAsia"/>
-          <w:szCs w:val="24"/>
-        </w:rPr>
-        <w:t xml:space="preserve"> 系统根据当前时间、旅客所处阶段和剩余时间生成有优先级的行动建议。</w:t>
-      </w:r>
-    </w:p>
-    <w:p>
-      <w:pPr>
-        <w:ind w:firstLine="480"/>
-        <w:rPr>
-          <w:rFonts w:ascii="仿宋_GB2312" w:eastAsia="仿宋_GB2312" w:cs="Times New Roman"/>
-          <w:szCs w:val="24"/>
-        </w:rPr>
-      </w:pPr>
-      <w:r>
-        <w:rPr>
-          <w:rFonts w:eastAsia="仿宋_GB2312" w:cs="Times New Roman"/>
-          <w:szCs w:val="24"/>
-        </w:rPr>
-        <w:t>4.</w:t>
-      </w:r>
-      <w:r>
-        <w:rPr>
-          <w:rFonts w:ascii="仿宋_GB2312" w:eastAsia="仿宋_GB2312" w:hint="eastAsia"/>
-          <w:szCs w:val="24"/>
-        </w:rPr>
-        <w:t xml:space="preserve"> 客户端展示建议、风险等级、建议依据和生成时间。</w:t>
-      </w:r>
-    </w:p>
-    <w:p>
-      <w:pPr>
-        <w:ind w:firstLine="480"/>
-        <w:rPr>
-          <w:rFonts w:ascii="仿宋_GB2312" w:eastAsia="仿宋_GB2312" w:cs="Times New Roman"/>
-          <w:szCs w:val="24"/>
-        </w:rPr>
-      </w:pPr>
-      <w:r>
-        <w:rPr>
-          <w:rFonts w:ascii="仿宋_GB2312" w:eastAsia="仿宋_GB2312" w:hint="eastAsia"/>
-          <w:szCs w:val="24"/>
-        </w:rPr>
-        <w:t>扩展交互动作：</w:t>
-      </w:r>
-    </w:p>
-    <w:p>
-      <w:pPr>
-        <w:ind w:firstLine="480"/>
-        <w:rPr>
-          <w:rFonts w:ascii="仿宋_GB2312" w:eastAsia="仿宋_GB2312" w:cs="Times New Roman"/>
-          <w:szCs w:val="24"/>
-        </w:rPr>
-      </w:pPr>
-      <w:r>
-        <w:rPr>
-          <w:rFonts w:eastAsia="仿宋_GB2312" w:cs="Times New Roman"/>
-          <w:szCs w:val="24"/>
-        </w:rPr>
-        <w:t>2</w:t>
-      </w:r>
-      <w:r>
-        <w:rPr>
-          <w:rFonts w:eastAsia="仿宋_GB2312" w:cs="Times New Roman"/>
-          <w:szCs w:val="24"/>
-        </w:rPr>
-        <w:t>a</w:t>
-      </w:r>
-      <w:r>
-        <w:rPr>
-          <w:rFonts w:eastAsia="仿宋_GB2312" w:cs="Times New Roman"/>
-          <w:szCs w:val="24"/>
-        </w:rPr>
-        <w:t>1</w:t>
-      </w:r>
-      <w:r>
-        <w:rPr>
-          <w:rFonts w:eastAsia="仿宋_GB2312" w:cs="Times New Roman"/>
-          <w:szCs w:val="24"/>
-        </w:rPr>
-        <w:t>.</w:t>
-      </w:r>
-      <w:r>
-        <w:rPr>
-          <w:rFonts w:ascii="仿宋_GB2312" w:eastAsia="仿宋_GB2312" w:hint="eastAsia"/>
-          <w:szCs w:val="24"/>
-        </w:rPr>
-        <w:t xml:space="preserve"> 行程数据不完整或过期：使用最近一次有效数据并给出降级提示。</w:t>
-      </w:r>
-    </w:p>
-    <w:p>
-      <w:pPr>
-        <w:ind w:firstLine="480"/>
-        <w:rPr>
-          <w:rFonts w:ascii="仿宋_GB2312" w:eastAsia="仿宋_GB2312" w:cs="Times New Roman"/>
-          <w:szCs w:val="24"/>
-        </w:rPr>
-      </w:pPr>
-      <w:r>
-        <w:rPr>
-          <w:rFonts w:eastAsia="仿宋_GB2312" w:cs="Times New Roman"/>
-          <w:szCs w:val="24"/>
-        </w:rPr>
-        <w:t>2a</w:t>
-      </w:r>
-      <w:r>
-        <w:rPr>
-          <w:rFonts w:eastAsia="仿宋_GB2312" w:cs="Times New Roman"/>
-          <w:szCs w:val="24"/>
-        </w:rPr>
-        <w:t>2</w:t>
-      </w:r>
-      <w:r>
-        <w:rPr>
-          <w:rFonts w:eastAsia="仿宋_GB2312" w:cs="Times New Roman"/>
-          <w:szCs w:val="24"/>
-        </w:rPr>
-        <w:t>.</w:t>
-      </w:r>
-      <w:r>
-        <w:rPr>
-          <w:rFonts w:ascii="仿宋_GB2312" w:eastAsia="仿宋_GB2312" w:hint="eastAsia"/>
-          <w:szCs w:val="24"/>
-        </w:rPr>
-        <w:t xml:space="preserve"> 当前定位不可用：基于最近一次有效位置生成建议，并提示位置不确定性。</w:t>
-      </w:r>
-    </w:p>
-    <w:p>
-      <w:pPr>
-        <w:ind w:firstLine="480"/>
-        <w:rPr>
-          <w:rFonts w:ascii="仿宋_GB2312" w:eastAsia="仿宋_GB2312" w:cs="Times New Roman"/>
-          <w:szCs w:val="24"/>
-        </w:rPr>
-      </w:pPr>
-      <w:r>
-        <w:rPr>
-          <w:rFonts w:eastAsia="仿宋_GB2312" w:cs="Times New Roman"/>
-          <w:szCs w:val="24"/>
-        </w:rPr>
-        <w:t>3a.</w:t>
-      </w:r>
-      <w:r>
-        <w:rPr>
-          <w:rFonts w:ascii="仿宋_GB2312" w:eastAsia="仿宋_GB2312" w:hint="eastAsia"/>
-          <w:szCs w:val="24"/>
-        </w:rPr>
-        <w:t xml:space="preserve"> 系统无法确定下一步：明确提示旅客向航司或机场工作人员确认，不输出确定性结论。</w:t>
-      </w:r>
-    </w:p>
-    <w:p>
-      <w:pPr>
-        <w:ind w:firstLine="480"/>
-        <w:rPr>
-          <w:rFonts w:ascii="仿宋_GB2312" w:eastAsia="仿宋_GB2312" w:cs="Times New Roman"/>
-          <w:szCs w:val="24"/>
-        </w:rPr>
-      </w:pPr>
-      <w:r>
-        <w:rPr>
-          <w:rFonts w:ascii="仿宋_GB2312" w:eastAsia="仿宋_GB2312" w:hint="eastAsia"/>
-          <w:szCs w:val="24"/>
-        </w:rPr>
-        <w:t>后置条件：旅客获得可解释、可执行的行程安排建议。</w:t>
-      </w:r>
-    </w:p>
-    <w:p>
-      <w:pPr>
-        <w:ind w:firstLine="480"/>
-        <w:rPr>
-          <w:rFonts w:ascii="仿宋_GB2312" w:eastAsia="仿宋_GB2312" w:cs="Times New Roman"/>
-          <w:szCs w:val="24"/>
-        </w:rPr>
-      </w:pPr>
-      <w:r>
-        <w:rPr>
-          <w:rFonts w:ascii="仿宋_GB2312" w:eastAsia="仿宋_GB2312" w:hint="eastAsia"/>
-          <w:szCs w:val="24"/>
-        </w:rPr>
-        <w:t>业务规则：值机、登机等关键时间作为硬约束；系统不自动执行改签、支付等高影响操作。</w:t>
-      </w:r>
-    </w:p>
-    <w:p>
-      <w:pPr>
-        <w:ind w:firstLine="480"/>
-        <w:rPr>
-          <w:rFonts w:ascii="仿宋_GB2312" w:eastAsia="仿宋_GB2312" w:cs="Times New Roman"/>
-          <w:szCs w:val="24"/>
-        </w:rPr>
-      </w:pPr>
-      <w:r>
-        <w:rPr>
-          <w:rFonts w:ascii="仿宋_GB2312" w:eastAsia="仿宋_GB2312" w:hint="eastAsia"/>
-          <w:szCs w:val="24"/>
-        </w:rPr>
-        <w:t>性能需求：</w:t>
-      </w:r>
-      <w:r>
-        <w:rPr>
-          <w:rFonts w:ascii="仿宋_GB2312" w:eastAsia="仿宋_GB2312"/>
-          <w:szCs w:val="24"/>
-        </w:rPr>
-        <w:t>建议生成应在可接受时间内完成，并支持数据变化后的及时更新。</w:t>
-      </w:r>
-    </w:p>
-    <w:p>
-      <w:pPr>
-        <w:ind w:firstLine="480"/>
-        <w:rPr>
-          <w:rFonts w:ascii="仿宋_GB2312" w:eastAsia="仿宋_GB2312" w:cs="Times New Roman"/>
-          <w:szCs w:val="24"/>
-        </w:rPr>
-      </w:pPr>
-      <w:r>
-        <w:rPr>
-          <w:rFonts w:ascii="仿宋_GB2312" w:eastAsia="仿宋_GB2312" w:hint="eastAsia"/>
-          <w:szCs w:val="24"/>
-        </w:rPr>
-        <w:t>可靠性需求：数据缺失或接口异常时仍可展示基础提示，不因单点故障中断服务。</w:t>
-      </w:r>
-      <w:r>
-        <w:rPr>
-          <w:rFonts w:hint="eastAsia"/>
-          <w:noProof/>
-        </w:rPr>
-        <w:lastRenderedPageBreak/>
-        <w:drawing>
-          <wp:inline distT="0" distB="0" distL="0" distR="0" wp14:anchorId="3D59B738" wp14:editId="784272E3">
-            <wp:extent cx="5274310" cy="5111115"/>
-            <wp:effectExtent l="0" t="0" r="2540" b="0"/>
-            <wp:docPr id="1551531370" name="图片 4"/>
-            <wp:cNvGraphicFramePr>
-              <a:graphicFrameLocks xmlns:a="http://schemas.openxmlformats.org/drawingml/2006/main" noChangeAspect="1"/>
-            </wp:cNvGraphicFramePr>
-            <a:graphic xmlns:a="http://schemas.openxmlformats.org/drawingml/2006/main">
-              <a:graphicData uri="http://schemas.openxmlformats.org/drawingml/2006/picture">
-                <pic:pic xmlns:pic="http://schemas.openxmlformats.org/drawingml/2006/picture">
-                  <pic:nvPicPr>
-                    <pic:cNvPr id="0" name="Picture 8"/>
-                    <pic:cNvPicPr>
-                      <a:picLocks noChangeAspect="1" noChangeArrowheads="1"/>
-                    </pic:cNvPicPr>
-                  </pic:nvPicPr>
-                  <pic:blipFill>
-                    <a:blip r:embed="rId19">
-                      <a:extLst>
-                        <a:ext uri="{28A0092B-C50C-407E-A947-70E740481C1C}">
-                          <a14:useLocalDpi xmlns:a14="http://schemas.microsoft.com/office/drawing/2010/main" val="0"/>
-                        </a:ext>
-                      </a:extLst>
-                    </a:blip>
-                    <a:srcRect/>
-                    <a:stretch>
-                      <a:fillRect/>
-                    </a:stretch>
-                  </pic:blipFill>
-                  <pic:spPr bwMode="auto">
-                    <a:xfrm>
-                      <a:off x="0" y="0"/>
-                      <a:ext cx="5274310" cy="5111115"/>
-                    </a:xfrm>
-                    <a:prstGeom prst="rect">
-                      <a:avLst/>
-                    </a:prstGeom>
-                    <a:noFill/>
-                    <a:ln>
-                      <a:noFill/>
-                    </a:ln>
-                  </pic:spPr>
-                </pic:pic>
-              </a:graphicData>
-            </a:graphic>
-          </wp:inline>
-        </w:drawing>
-      </w:r>
-    </w:p>
-    <w:p>
-      <w:pPr>
-        <w:pStyle w:val="4"/>
-      </w:pPr>
-      <w:r>
-        <w:t xml:space="preserve">2.2.2.2 </w:t>
-      </w:r>
-      <w:r>
-        <w:t>获取行程安排建议用例顺序图</w:t>
-      </w:r>
-    </w:p>
-    <w:p>
-      <w:pPr>
-        <w:pStyle w:val="3"/>
-      </w:pPr>
-      <w:bookmarkStart w:id="18" w:name="_Toc239798806"/>
-      <w:r>
-        <w:t xml:space="preserve">2.2.3 </w:t>
-      </w:r>
-      <w:r>
-        <w:t>用例名：获取行程延误风险</w:t>
+      <w:r>
+        <w:t>图中各类与前述软件需求中的系统组件、数据对象和处理过程相对应。</w:t>
       </w:r>
       <w:bookmarkEnd w:id="18"/>
-    </w:p>
-    <w:p>
-      <w:pPr>
-        <w:pStyle w:val="4"/>
-      </w:pPr>
-      <w:r>
-        <w:t xml:space="preserve">2.2.3.1 </w:t>
-      </w:r>
-      <w:r>
-        <w:t>获取行程延误风险用例描述</w:t>
-      </w:r>
-    </w:p>
-    <w:p>
-      <w:pPr>
-        <w:ind w:firstLine="480"/>
-        <w:rPr>
-          <w:rFonts w:ascii="仿宋_GB2312" w:eastAsia="仿宋_GB2312" w:cs="Times New Roman"/>
-          <w:szCs w:val="24"/>
-        </w:rPr>
-      </w:pPr>
-      <w:r>
-        <w:rPr>
-          <w:rFonts w:ascii="仿宋_GB2312" w:eastAsia="仿宋_GB2312" w:hint="eastAsia"/>
-          <w:szCs w:val="24"/>
-        </w:rPr>
-        <w:t>业务目标：旅客获取航班延误、机场运行、交通和路径变化等因素导致的行程延误风险。</w:t>
-      </w:r>
-    </w:p>
-    <w:p>
-      <w:pPr>
-        <w:ind w:firstLine="480"/>
-        <w:rPr>
-          <w:rFonts w:ascii="仿宋_GB2312" w:eastAsia="仿宋_GB2312" w:cs="Times New Roman"/>
-          <w:szCs w:val="24"/>
-        </w:rPr>
-      </w:pPr>
-      <w:r>
-        <w:rPr>
-          <w:rFonts w:ascii="仿宋_GB2312" w:eastAsia="仿宋_GB2312" w:hint="eastAsia"/>
-          <w:szCs w:val="24"/>
-        </w:rPr>
-        <w:t>执行者：旅客（发起者）；数据来源（通过“数据处理分析”参与）。</w:t>
-      </w:r>
-    </w:p>
-    <w:p>
-      <w:pPr>
-        <w:ind w:firstLine="480"/>
-        <w:rPr>
-          <w:rFonts w:ascii="仿宋_GB2312" w:eastAsia="仿宋_GB2312" w:cs="Times New Roman"/>
-          <w:szCs w:val="24"/>
-        </w:rPr>
-      </w:pPr>
-      <w:r>
-        <w:rPr>
-          <w:rFonts w:ascii="仿宋_GB2312" w:eastAsia="仿宋_GB2312" w:hint="eastAsia"/>
-          <w:szCs w:val="24"/>
-        </w:rPr>
-        <w:t>触发条件：旅客查看行程风险，或航班、机场、路线等状态发生变化。</w:t>
-      </w:r>
-    </w:p>
-    <w:p>
-      <w:pPr>
-        <w:ind w:firstLine="480"/>
-        <w:rPr>
-          <w:rFonts w:ascii="仿宋_GB2312" w:eastAsia="仿宋_GB2312" w:cs="Times New Roman"/>
-          <w:szCs w:val="24"/>
-        </w:rPr>
-      </w:pPr>
-      <w:r>
-        <w:rPr>
-          <w:rFonts w:ascii="仿宋_GB2312" w:eastAsia="仿宋_GB2312" w:hint="eastAsia"/>
-          <w:szCs w:val="24"/>
-        </w:rPr>
-        <w:t>前置条件：已获取个人行程信息；数据来源可用或已有最近一次有效数据。</w:t>
-      </w:r>
-    </w:p>
-    <w:p>
-      <w:pPr>
-        <w:ind w:firstLine="480"/>
-        <w:rPr>
-          <w:rFonts w:ascii="仿宋_GB2312" w:eastAsia="仿宋_GB2312" w:cs="Times New Roman"/>
-          <w:szCs w:val="24"/>
-        </w:rPr>
-      </w:pPr>
-      <w:r>
-        <w:rPr>
-          <w:rFonts w:ascii="仿宋_GB2312" w:eastAsia="仿宋_GB2312" w:hint="eastAsia"/>
-          <w:szCs w:val="24"/>
-        </w:rPr>
-        <w:t>基本交互动作：</w:t>
-      </w:r>
-    </w:p>
-    <w:p>
-      <w:pPr>
-        <w:ind w:firstLine="480"/>
-        <w:rPr>
-          <w:rFonts w:ascii="仿宋_GB2312" w:eastAsia="仿宋_GB2312" w:cs="Times New Roman"/>
-          <w:szCs w:val="24"/>
-        </w:rPr>
-      </w:pPr>
-      <w:r>
-        <w:rPr>
-          <w:rFonts w:eastAsia="仿宋_GB2312" w:cs="Times New Roman"/>
-          <w:szCs w:val="24"/>
-        </w:rPr>
-        <w:t>1.</w:t>
-      </w:r>
-      <w:r>
-        <w:rPr>
-          <w:rFonts w:ascii="仿宋_GB2312" w:eastAsia="仿宋_GB2312" w:hint="eastAsia"/>
-          <w:szCs w:val="24"/>
-        </w:rPr>
-        <w:t xml:space="preserve"> 旅客请求获取行程延误风险。</w:t>
-      </w:r>
-    </w:p>
-    <w:p>
-      <w:pPr>
-        <w:ind w:firstLine="480"/>
-        <w:rPr>
-          <w:rFonts w:ascii="仿宋_GB2312" w:eastAsia="仿宋_GB2312" w:cs="Times New Roman"/>
-          <w:szCs w:val="24"/>
-        </w:rPr>
-      </w:pPr>
-      <w:r>
-        <w:rPr>
-          <w:rFonts w:eastAsia="仿宋_GB2312" w:cs="Times New Roman"/>
-          <w:szCs w:val="24"/>
-        </w:rPr>
-        <w:t>2.</w:t>
-      </w:r>
-      <w:r>
-        <w:rPr>
-          <w:rFonts w:ascii="仿宋_GB2312" w:eastAsia="仿宋_GB2312" w:hint="eastAsia"/>
-          <w:szCs w:val="24"/>
-        </w:rPr>
-        <w:t xml:space="preserve"> 系统读取当前航班、机场、路线、时间和旅客位置状态。</w:t>
-      </w:r>
-    </w:p>
-    <w:p>
-      <w:pPr>
-        <w:ind w:firstLine="480"/>
-        <w:rPr>
-          <w:rFonts w:ascii="仿宋_GB2312" w:eastAsia="仿宋_GB2312" w:cs="Times New Roman"/>
-          <w:szCs w:val="24"/>
-        </w:rPr>
-      </w:pPr>
-      <w:r>
-        <w:rPr>
-          <w:rFonts w:eastAsia="仿宋_GB2312" w:cs="Times New Roman"/>
-          <w:szCs w:val="24"/>
-        </w:rPr>
-        <w:lastRenderedPageBreak/>
-        <w:t>3.</w:t>
-      </w:r>
-      <w:r>
-        <w:rPr>
-          <w:rFonts w:ascii="仿宋_GB2312" w:eastAsia="仿宋_GB2312" w:hint="eastAsia"/>
-          <w:szCs w:val="24"/>
-        </w:rPr>
-        <w:t xml:space="preserve"> 数据处理分析对最新数据进行标准化、校验和降级判断。</w:t>
-      </w:r>
-    </w:p>
-    <w:p>
-      <w:pPr>
-        <w:ind w:firstLine="480"/>
-        <w:rPr>
-          <w:rFonts w:ascii="仿宋_GB2312" w:eastAsia="仿宋_GB2312" w:cs="Times New Roman"/>
-          <w:szCs w:val="24"/>
-        </w:rPr>
-      </w:pPr>
-      <w:r>
-        <w:rPr>
-          <w:rFonts w:eastAsia="仿宋_GB2312" w:cs="Times New Roman"/>
-          <w:szCs w:val="24"/>
-        </w:rPr>
-        <w:t>4.</w:t>
-      </w:r>
-      <w:r>
-        <w:rPr>
-          <w:rFonts w:ascii="仿宋_GB2312" w:eastAsia="仿宋_GB2312" w:hint="eastAsia"/>
-          <w:szCs w:val="24"/>
-        </w:rPr>
-        <w:t xml:space="preserve"> 系统分析风险等级、主要风险因素和可能影响。</w:t>
-      </w:r>
-    </w:p>
-    <w:p>
-      <w:pPr>
-        <w:ind w:firstLine="480"/>
-        <w:rPr>
-          <w:rFonts w:ascii="仿宋_GB2312" w:eastAsia="仿宋_GB2312" w:cs="Times New Roman"/>
-          <w:szCs w:val="24"/>
-        </w:rPr>
-      </w:pPr>
-      <w:r>
-        <w:rPr>
-          <w:rFonts w:eastAsia="仿宋_GB2312" w:cs="Times New Roman"/>
-          <w:szCs w:val="24"/>
-        </w:rPr>
-        <w:t>5.</w:t>
-      </w:r>
-      <w:r>
-        <w:rPr>
-          <w:rFonts w:ascii="仿宋_GB2312" w:eastAsia="仿宋_GB2312" w:hint="eastAsia"/>
-          <w:szCs w:val="24"/>
-        </w:rPr>
-        <w:t xml:space="preserve"> 客户端展示风险等级、风险说明、数据来源和更新时间。</w:t>
-      </w:r>
-    </w:p>
-    <w:p>
-      <w:pPr>
-        <w:ind w:firstLine="480"/>
-        <w:rPr>
-          <w:rFonts w:ascii="仿宋_GB2312" w:eastAsia="仿宋_GB2312" w:cs="Times New Roman"/>
-          <w:szCs w:val="24"/>
-        </w:rPr>
-      </w:pPr>
-      <w:r>
-        <w:rPr>
-          <w:rFonts w:ascii="仿宋_GB2312" w:eastAsia="仿宋_GB2312" w:hint="eastAsia"/>
-          <w:szCs w:val="24"/>
-        </w:rPr>
-        <w:t>扩展交互动作：</w:t>
-      </w:r>
-    </w:p>
-    <w:p>
-      <w:pPr>
-        <w:ind w:firstLine="480"/>
-        <w:rPr>
-          <w:rFonts w:ascii="仿宋_GB2312" w:eastAsia="仿宋_GB2312" w:cs="Times New Roman"/>
-          <w:szCs w:val="24"/>
-        </w:rPr>
-      </w:pPr>
-      <w:r>
-        <w:rPr>
-          <w:rFonts w:eastAsia="仿宋_GB2312" w:cs="Times New Roman"/>
-          <w:szCs w:val="24"/>
-        </w:rPr>
-        <w:t>2</w:t>
-      </w:r>
-      <w:r>
-        <w:rPr>
-          <w:rFonts w:eastAsia="仿宋_GB2312" w:cs="Times New Roman"/>
-          <w:szCs w:val="24"/>
-        </w:rPr>
-        <w:t>a</w:t>
-      </w:r>
-      <w:r>
-        <w:rPr>
-          <w:rFonts w:eastAsia="仿宋_GB2312" w:cs="Times New Roman"/>
-          <w:szCs w:val="24"/>
-        </w:rPr>
-        <w:t>1</w:t>
-      </w:r>
-      <w:r>
-        <w:rPr>
-          <w:rFonts w:eastAsia="仿宋_GB2312" w:cs="Times New Roman"/>
-          <w:szCs w:val="24"/>
-        </w:rPr>
-        <w:t>.</w:t>
-      </w:r>
-      <w:r>
-        <w:rPr>
-          <w:rFonts w:ascii="仿宋_GB2312" w:eastAsia="仿宋_GB2312" w:hint="eastAsia"/>
-          <w:szCs w:val="24"/>
-        </w:rPr>
-        <w:t xml:space="preserve"> 数据来源不可用：使用最近一次有效数据并明确提示风险判断时效有限。</w:t>
-      </w:r>
-    </w:p>
-    <w:p>
-      <w:pPr>
-        <w:ind w:firstLine="480"/>
-        <w:rPr>
-          <w:rFonts w:ascii="仿宋_GB2312" w:eastAsia="仿宋_GB2312" w:cs="Times New Roman"/>
-          <w:szCs w:val="24"/>
-        </w:rPr>
-      </w:pPr>
-      <w:r>
-        <w:rPr>
-          <w:rFonts w:eastAsia="仿宋_GB2312" w:cs="Times New Roman"/>
-          <w:szCs w:val="24"/>
-        </w:rPr>
-        <w:t>2a</w:t>
-      </w:r>
-      <w:r>
-        <w:rPr>
-          <w:rFonts w:eastAsia="仿宋_GB2312" w:cs="Times New Roman"/>
-          <w:szCs w:val="24"/>
-        </w:rPr>
-        <w:t>2</w:t>
-      </w:r>
-      <w:r>
-        <w:rPr>
-          <w:rFonts w:eastAsia="仿宋_GB2312" w:cs="Times New Roman"/>
-          <w:szCs w:val="24"/>
-        </w:rPr>
-        <w:t>.</w:t>
-      </w:r>
-      <w:r>
-        <w:rPr>
-          <w:rFonts w:ascii="仿宋_GB2312" w:eastAsia="仿宋_GB2312" w:hint="eastAsia"/>
-          <w:szCs w:val="24"/>
-        </w:rPr>
-        <w:t xml:space="preserve"> 航班或机场状态未知：标记为未知，不输出确定性延误结论。</w:t>
-      </w:r>
-    </w:p>
-    <w:p>
-      <w:pPr>
-        <w:ind w:firstLine="480"/>
-        <w:rPr>
-          <w:rFonts w:ascii="仿宋_GB2312" w:eastAsia="仿宋_GB2312" w:cs="Times New Roman"/>
-          <w:szCs w:val="24"/>
-        </w:rPr>
-      </w:pPr>
-      <w:r>
-        <w:rPr>
-          <w:rFonts w:ascii="仿宋_GB2312" w:eastAsia="仿宋_GB2312" w:hint="eastAsia"/>
-          <w:szCs w:val="24"/>
-        </w:rPr>
-        <w:t>后置条件：旅客获取到有时间窗口和数据依据的行程延误风险。</w:t>
-      </w:r>
-    </w:p>
-    <w:p>
-      <w:pPr>
-        <w:ind w:firstLine="480"/>
-        <w:rPr>
-          <w:rFonts w:ascii="仿宋_GB2312" w:eastAsia="仿宋_GB2312" w:cs="Times New Roman"/>
-          <w:szCs w:val="24"/>
-        </w:rPr>
-      </w:pPr>
-      <w:r>
-        <w:rPr>
-          <w:rFonts w:ascii="仿宋_GB2312" w:eastAsia="仿宋_GB2312" w:hint="eastAsia"/>
-          <w:szCs w:val="24"/>
-        </w:rPr>
-        <w:t>业务规则：风险展示以航班、机场和交通的最新可用数据为依据；无法确认时不夸大风险。</w:t>
-      </w:r>
-    </w:p>
-    <w:p>
-      <w:pPr>
-        <w:ind w:firstLine="480"/>
-        <w:rPr>
-          <w:rFonts w:ascii="仿宋_GB2312" w:eastAsia="仿宋_GB2312" w:cs="Times New Roman"/>
-          <w:szCs w:val="24"/>
-        </w:rPr>
-      </w:pPr>
-      <w:r>
-        <w:rPr>
-          <w:rFonts w:ascii="仿宋_GB2312" w:eastAsia="仿宋_GB2312" w:hint="eastAsia"/>
-          <w:szCs w:val="24"/>
-        </w:rPr>
-        <w:t>性能需求：风险数据应按合理周期更新，数据变化后应及时重新分析。</w:t>
-      </w:r>
-    </w:p>
-    <w:p>
-      <w:pPr>
-        <w:ind w:firstLine="480"/>
-        <w:rPr>
-          <w:rFonts w:ascii="仿宋_GB2312" w:eastAsia="仿宋_GB2312" w:cs="Times New Roman"/>
-          <w:szCs w:val="24"/>
-        </w:rPr>
-      </w:pPr>
-      <w:r>
-        <w:rPr>
-          <w:rFonts w:ascii="仿宋_GB2312" w:eastAsia="仿宋_GB2312" w:hint="eastAsia"/>
-          <w:szCs w:val="24"/>
-        </w:rPr>
-        <w:t>可靠性需求：外部数据异常或延迟时，系统应继续运行并显示最后更新时间。</w:t>
-      </w:r>
-    </w:p>
-    <w:p>
-      <w:pPr>
-        <w:pStyle w:val="4"/>
-      </w:pPr>
-      <w:r>
-        <w:lastRenderedPageBreak/>
-        <w:t xml:space="preserve">2.2.3.2 </w:t>
-      </w:r>
-      <w:r>
-        <w:t>获取行程延误风险用例顺序图</w:t>
-      </w:r>
-    </w:p>
-    <w:p>
-      <w:pPr>
-        <w:ind w:firstLine="480"/>
-        <w:rPr>
-          <w:rFonts w:hint="eastAsia"/>
-        </w:rPr>
-      </w:pPr>
-      <w:r>
-        <w:rPr>
-          <w:rFonts w:hint="eastAsia"/>
-          <w:noProof/>
-        </w:rPr>
-        <w:drawing>
-          <wp:inline distT="0" distB="0" distL="0" distR="0" wp14:anchorId="344E8E4F" wp14:editId="55BD6C0B">
-            <wp:extent cx="5274310" cy="5112385"/>
-            <wp:effectExtent l="0" t="0" r="2540" b="0"/>
-            <wp:docPr id="1223305675" name="图片 5"/>
-            <wp:cNvGraphicFramePr>
-              <a:graphicFrameLocks xmlns:a="http://schemas.openxmlformats.org/drawingml/2006/main" noChangeAspect="1"/>
-            </wp:cNvGraphicFramePr>
-            <a:graphic xmlns:a="http://schemas.openxmlformats.org/drawingml/2006/main">
-              <a:graphicData uri="http://schemas.openxmlformats.org/drawingml/2006/picture">
-                <pic:pic xmlns:pic="http://schemas.openxmlformats.org/drawingml/2006/picture">
-                  <pic:nvPicPr>
-                    <pic:cNvPr id="0" name="Picture 10"/>
-                    <pic:cNvPicPr>
-                      <a:picLocks noChangeAspect="1" noChangeArrowheads="1"/>
-                    </pic:cNvPicPr>
-                  </pic:nvPicPr>
-                  <pic:blipFill>
-                    <a:blip r:embed="rId20">
-                      <a:extLst>
-                        <a:ext uri="{28A0092B-C50C-407E-A947-70E740481C1C}">
-                          <a14:useLocalDpi xmlns:a14="http://schemas.microsoft.com/office/drawing/2010/main" val="0"/>
-                        </a:ext>
-                      </a:extLst>
-                    </a:blip>
-                    <a:srcRect/>
-                    <a:stretch>
-                      <a:fillRect/>
-                    </a:stretch>
-                  </pic:blipFill>
-                  <pic:spPr bwMode="auto">
-                    <a:xfrm>
-                      <a:off x="0" y="0"/>
-                      <a:ext cx="5274310" cy="5112385"/>
-                    </a:xfrm>
-                    <a:prstGeom prst="rect">
-                      <a:avLst/>
-                    </a:prstGeom>
-                    <a:noFill/>
-                    <a:ln>
-                      <a:noFill/>
-                    </a:ln>
-                  </pic:spPr>
-                </pic:pic>
-              </a:graphicData>
-            </a:graphic>
-          </wp:inline>
-        </w:drawing>
-      </w:r>
-    </w:p>
-    <w:p>
-      <w:pPr>
-        <w:pStyle w:val="3"/>
-      </w:pPr>
-      <w:bookmarkStart w:id="19" w:name="_Toc239798807"/>
-      <w:r>
-        <w:t xml:space="preserve">2.2.4 </w:t>
-      </w:r>
-      <w:r>
-        <w:t>用例名：导航到机场</w:t>
-      </w:r>
-      <w:bookmarkEnd w:id="19"/>
-    </w:p>
-    <w:p>
-      <w:pPr>
-        <w:pStyle w:val="4"/>
-      </w:pPr>
-      <w:r>
-        <w:t xml:space="preserve">2.2.4.1 </w:t>
-      </w:r>
-      <w:r>
-        <w:t>导航到机场用例描述</w:t>
-      </w:r>
-    </w:p>
-    <w:p>
-      <w:pPr>
-        <w:ind w:firstLine="480"/>
-        <w:rPr>
-          <w:rFonts w:ascii="仿宋_GB2312" w:eastAsia="仿宋_GB2312" w:cs="Times New Roman"/>
-          <w:szCs w:val="24"/>
-        </w:rPr>
-      </w:pPr>
-      <w:r>
-        <w:rPr>
-          <w:rFonts w:ascii="仿宋_GB2312" w:eastAsia="仿宋_GB2312" w:hint="eastAsia"/>
-          <w:szCs w:val="24"/>
-        </w:rPr>
-        <w:t>业务目标：旅客通过系统一键导航到机场，并在地图应用或浏览器不可用时获得清晰的替代提示。</w:t>
-      </w:r>
-    </w:p>
-    <w:p>
-      <w:pPr>
-        <w:ind w:firstLine="480"/>
-        <w:rPr>
-          <w:rFonts w:ascii="仿宋_GB2312" w:eastAsia="仿宋_GB2312" w:cs="Times New Roman"/>
-          <w:szCs w:val="24"/>
-        </w:rPr>
-      </w:pPr>
-      <w:r>
-        <w:rPr>
-          <w:rFonts w:ascii="仿宋_GB2312" w:eastAsia="仿宋_GB2312" w:hint="eastAsia"/>
-          <w:szCs w:val="24"/>
-        </w:rPr>
-        <w:t>执行者：旅客（发起者）；外部地图导航应用（支撑系统）。</w:t>
-      </w:r>
-    </w:p>
-    <w:p>
-      <w:pPr>
-        <w:ind w:firstLine="480"/>
-        <w:rPr>
-          <w:rFonts w:ascii="仿宋_GB2312" w:eastAsia="仿宋_GB2312" w:cs="Times New Roman"/>
-          <w:szCs w:val="24"/>
-        </w:rPr>
-      </w:pPr>
-      <w:r>
-        <w:rPr>
-          <w:rFonts w:ascii="仿宋_GB2312" w:eastAsia="仿宋_GB2312" w:hint="eastAsia"/>
-          <w:szCs w:val="24"/>
-        </w:rPr>
-        <w:t>触发条件：旅客查看行程信息或行动建议后，点击“导航到机场”。</w:t>
-      </w:r>
-    </w:p>
-    <w:p>
-      <w:pPr>
-        <w:ind w:firstLine="480"/>
-        <w:rPr>
-          <w:rFonts w:ascii="仿宋_GB2312" w:eastAsia="仿宋_GB2312" w:cs="Times New Roman"/>
-          <w:szCs w:val="24"/>
-        </w:rPr>
-      </w:pPr>
-      <w:r>
-        <w:rPr>
-          <w:rFonts w:ascii="仿宋_GB2312" w:eastAsia="仿宋_GB2312" w:hint="eastAsia"/>
-          <w:szCs w:val="24"/>
-        </w:rPr>
-        <w:t>前置条件：已获取当前位置或最近一次有效位置；已确定机场目的地。</w:t>
-      </w:r>
-    </w:p>
-    <w:p>
-      <w:pPr>
-        <w:ind w:firstLine="480"/>
-        <w:rPr>
-          <w:rFonts w:ascii="仿宋_GB2312" w:eastAsia="仿宋_GB2312" w:cs="Times New Roman"/>
-          <w:szCs w:val="24"/>
-        </w:rPr>
-      </w:pPr>
-      <w:r>
-        <w:rPr>
-          <w:rFonts w:ascii="仿宋_GB2312" w:eastAsia="仿宋_GB2312" w:hint="eastAsia"/>
-          <w:szCs w:val="24"/>
-        </w:rPr>
-        <w:t>基本交互动作：</w:t>
-      </w:r>
-    </w:p>
-    <w:p>
-      <w:pPr>
-        <w:ind w:firstLine="480"/>
-        <w:rPr>
-          <w:rFonts w:ascii="仿宋_GB2312" w:eastAsia="仿宋_GB2312" w:cs="Times New Roman"/>
-          <w:szCs w:val="24"/>
-        </w:rPr>
-      </w:pPr>
-      <w:r>
-        <w:rPr>
-          <w:rFonts w:eastAsia="仿宋_GB2312" w:cs="Times New Roman"/>
-          <w:szCs w:val="24"/>
-        </w:rPr>
-        <w:t>1.</w:t>
-      </w:r>
-      <w:r>
-        <w:rPr>
-          <w:rFonts w:ascii="仿宋_GB2312" w:eastAsia="仿宋_GB2312" w:hint="eastAsia"/>
-          <w:szCs w:val="24"/>
-        </w:rPr>
-        <w:t xml:space="preserve"> 旅客点击“导航到机场”。</w:t>
-      </w:r>
-    </w:p>
-    <w:p>
-      <w:pPr>
-        <w:ind w:firstLine="480"/>
-        <w:rPr>
-          <w:rFonts w:ascii="仿宋_GB2312" w:eastAsia="仿宋_GB2312" w:cs="Times New Roman"/>
-          <w:szCs w:val="24"/>
-        </w:rPr>
-      </w:pPr>
-      <w:r>
-        <w:rPr>
-          <w:rFonts w:eastAsia="仿宋_GB2312" w:cs="Times New Roman"/>
-          <w:szCs w:val="24"/>
-        </w:rPr>
-        <w:lastRenderedPageBreak/>
-        <w:t>2.</w:t>
-      </w:r>
-      <w:r>
-        <w:rPr>
-          <w:rFonts w:ascii="仿宋_GB2312" w:eastAsia="仿宋_GB2312" w:hint="eastAsia"/>
-          <w:szCs w:val="24"/>
-        </w:rPr>
-        <w:t xml:space="preserve"> 系统读取当前位置、机场目的地和可用导航服务。</w:t>
-      </w:r>
-    </w:p>
-    <w:p>
-      <w:pPr>
-        <w:ind w:firstLine="480"/>
-        <w:rPr>
-          <w:rFonts w:ascii="仿宋_GB2312" w:eastAsia="仿宋_GB2312" w:cs="Times New Roman"/>
-          <w:szCs w:val="24"/>
-        </w:rPr>
-      </w:pPr>
-      <w:r>
-        <w:rPr>
-          <w:rFonts w:eastAsia="仿宋_GB2312" w:cs="Times New Roman"/>
-          <w:szCs w:val="24"/>
-        </w:rPr>
-        <w:t xml:space="preserve">3. </w:t>
-      </w:r>
-      <w:r>
-        <w:rPr>
-          <w:rFonts w:ascii="仿宋_GB2312" w:eastAsia="仿宋_GB2312" w:hint="eastAsia"/>
-          <w:szCs w:val="24"/>
-        </w:rPr>
-        <w:t>系统生成包含当前位置与机场目的地的导航地址。</w:t>
-      </w:r>
-    </w:p>
-    <w:p>
-      <w:pPr>
-        <w:ind w:firstLine="480"/>
-        <w:rPr>
-          <w:rFonts w:ascii="仿宋_GB2312" w:eastAsia="仿宋_GB2312" w:cs="Times New Roman"/>
-          <w:szCs w:val="24"/>
-        </w:rPr>
-      </w:pPr>
-      <w:r>
-        <w:rPr>
-          <w:rFonts w:eastAsia="仿宋_GB2312" w:cs="Times New Roman"/>
-          <w:szCs w:val="24"/>
-        </w:rPr>
-        <w:t>4.</w:t>
-      </w:r>
-      <w:r>
-        <w:rPr>
-          <w:rFonts w:ascii="仿宋_GB2312" w:eastAsia="仿宋_GB2312" w:hint="eastAsia"/>
-          <w:szCs w:val="24"/>
-        </w:rPr>
-        <w:t xml:space="preserve"> 系统跳转到地图导航应用；应用未安装时回退为浏览器打开导航网页。</w:t>
-      </w:r>
-    </w:p>
-    <w:p>
-      <w:pPr>
-        <w:ind w:firstLine="480"/>
-        <w:rPr>
-          <w:rFonts w:ascii="仿宋_GB2312" w:eastAsia="仿宋_GB2312" w:cs="Times New Roman"/>
-          <w:szCs w:val="24"/>
-        </w:rPr>
-      </w:pPr>
-      <w:r>
-        <w:rPr>
-          <w:rFonts w:eastAsia="仿宋_GB2312" w:cs="Times New Roman"/>
-          <w:szCs w:val="24"/>
-        </w:rPr>
-        <w:t>5.</w:t>
-      </w:r>
-      <w:r>
-        <w:rPr>
-          <w:rFonts w:ascii="仿宋_GB2312" w:eastAsia="仿宋_GB2312" w:hint="eastAsia"/>
-          <w:szCs w:val="24"/>
-        </w:rPr>
-        <w:t xml:space="preserve"> 返回系统后，客户端继续展示机场内值机、安检、登机口等文字指引。</w:t>
-      </w:r>
-    </w:p>
-    <w:p>
-      <w:pPr>
-        <w:ind w:firstLine="480"/>
-        <w:rPr>
-          <w:rFonts w:ascii="仿宋_GB2312" w:eastAsia="仿宋_GB2312" w:cs="Times New Roman"/>
-          <w:szCs w:val="24"/>
-        </w:rPr>
-      </w:pPr>
-      <w:r>
-        <w:rPr>
-          <w:rFonts w:ascii="仿宋_GB2312" w:eastAsia="仿宋_GB2312" w:hint="eastAsia"/>
-          <w:szCs w:val="24"/>
-        </w:rPr>
-        <w:t>扩展交互动作：</w:t>
-      </w:r>
-    </w:p>
-    <w:p>
-      <w:pPr>
-        <w:ind w:firstLine="480"/>
-        <w:rPr>
-          <w:rFonts w:ascii="仿宋_GB2312" w:eastAsia="仿宋_GB2312" w:cs="Times New Roman"/>
-          <w:szCs w:val="24"/>
-        </w:rPr>
-      </w:pPr>
-      <w:r>
-        <w:rPr>
-          <w:rFonts w:eastAsia="仿宋_GB2312" w:cs="Times New Roman"/>
-          <w:szCs w:val="24"/>
-        </w:rPr>
-        <w:t>2</w:t>
-      </w:r>
-      <w:r>
-        <w:rPr>
-          <w:rFonts w:eastAsia="仿宋_GB2312" w:cs="Times New Roman"/>
-          <w:szCs w:val="24"/>
-        </w:rPr>
-        <w:t>a.</w:t>
-      </w:r>
-      <w:r>
-        <w:rPr>
-          <w:rFonts w:ascii="仿宋_GB2312" w:eastAsia="仿宋_GB2312" w:hint="eastAsia"/>
-          <w:szCs w:val="24"/>
-        </w:rPr>
-        <w:t xml:space="preserve"> 当前位置不可用：使用手动选择的位置或最近一次有效位置生成导航，并提示定位精度。</w:t>
-      </w:r>
-    </w:p>
-    <w:p>
-      <w:pPr>
-        <w:ind w:firstLine="480"/>
-        <w:rPr>
-          <w:rFonts w:ascii="仿宋_GB2312" w:eastAsia="仿宋_GB2312" w:cs="Times New Roman"/>
-          <w:szCs w:val="24"/>
-        </w:rPr>
-      </w:pPr>
-      <w:r>
-        <w:rPr>
-          <w:rFonts w:eastAsia="仿宋_GB2312" w:cs="Times New Roman"/>
-          <w:szCs w:val="24"/>
-        </w:rPr>
-        <w:t>4</w:t>
-      </w:r>
-      <w:r>
-        <w:rPr>
-          <w:rFonts w:eastAsia="仿宋_GB2312" w:cs="Times New Roman"/>
-          <w:szCs w:val="24"/>
-        </w:rPr>
-        <w:t>a.</w:t>
-      </w:r>
-      <w:r>
-        <w:rPr>
-          <w:rFonts w:ascii="仿宋_GB2312" w:eastAsia="仿宋_GB2312" w:hint="eastAsia"/>
-          <w:szCs w:val="24"/>
-        </w:rPr>
-        <w:t xml:space="preserve"> 导航跳转失败：提示旅客手动打开导航应用，不影响其他行程信息展示。</w:t>
-      </w:r>
-    </w:p>
-    <w:p>
-      <w:pPr>
-        <w:ind w:firstLine="480"/>
-        <w:rPr>
-          <w:rFonts w:ascii="仿宋_GB2312" w:eastAsia="仿宋_GB2312" w:cs="Times New Roman"/>
-          <w:szCs w:val="24"/>
-        </w:rPr>
-      </w:pPr>
-      <w:r>
-        <w:rPr>
-          <w:rFonts w:ascii="仿宋_GB2312" w:eastAsia="仿宋_GB2312" w:hint="eastAsia"/>
-          <w:szCs w:val="24"/>
-        </w:rPr>
-        <w:t>后置条件：导航已启动或已提示旅客可用替代方式。</w:t>
-      </w:r>
-    </w:p>
-    <w:p>
-      <w:pPr>
-        <w:ind w:firstLine="480"/>
-        <w:rPr>
-          <w:rFonts w:ascii="仿宋_GB2312" w:eastAsia="仿宋_GB2312" w:cs="Times New Roman"/>
-          <w:szCs w:val="24"/>
-        </w:rPr>
-      </w:pPr>
-      <w:r>
-        <w:rPr>
-          <w:rFonts w:ascii="仿宋_GB2312" w:eastAsia="仿宋_GB2312" w:hint="eastAsia"/>
-          <w:szCs w:val="24"/>
-        </w:rPr>
-        <w:t>业务规则：系统只负责跳转导航，不获取或保存导航过程中的轨迹；高影响操作仍需旅客确认。</w:t>
-      </w:r>
-    </w:p>
-    <w:p>
-      <w:pPr>
-        <w:ind w:firstLine="480"/>
-        <w:rPr>
-          <w:rFonts w:ascii="仿宋_GB2312" w:eastAsia="仿宋_GB2312" w:cs="Times New Roman"/>
-          <w:szCs w:val="24"/>
-        </w:rPr>
-      </w:pPr>
-      <w:r>
-        <w:rPr>
-          <w:rFonts w:ascii="仿宋_GB2312" w:eastAsia="仿宋_GB2312" w:hint="eastAsia"/>
-          <w:szCs w:val="24"/>
-        </w:rPr>
-        <w:t>性能需求：</w:t>
-      </w:r>
-      <w:r>
-        <w:rPr>
-          <w:rFonts w:ascii="仿宋_GB2312" w:eastAsia="仿宋_GB2312"/>
-          <w:szCs w:val="24"/>
-        </w:rPr>
-        <w:t>点击导航后应尽快响应并完成跳转。</w:t>
-      </w:r>
-    </w:p>
-    <w:p>
-      <w:pPr>
-        <w:ind w:firstLine="480"/>
-        <w:rPr>
-          <w:rFonts w:ascii="仿宋_GB2312" w:eastAsia="仿宋_GB2312" w:cs="Times New Roman"/>
-          <w:szCs w:val="24"/>
-        </w:rPr>
-      </w:pPr>
-      <w:r>
-        <w:rPr>
-          <w:rFonts w:ascii="仿宋_GB2312" w:eastAsia="仿宋_GB2312" w:hint="eastAsia"/>
-          <w:szCs w:val="24"/>
-        </w:rPr>
-        <w:t>可靠性需求：导航失败时应有明确提示，并保持行程状态持续更新。</w:t>
-      </w:r>
-    </w:p>
-    <w:p>
-      <w:pPr>
-        <w:pStyle w:val="4"/>
-      </w:pPr>
-      <w:r>
-        <w:lastRenderedPageBreak/>
-        <w:t xml:space="preserve">2.2.4.2 </w:t>
-      </w:r>
-      <w:r>
-        <w:t>导航到机场用例顺序图</w:t>
-      </w:r>
-    </w:p>
-    <w:p>
-      <w:pPr>
-        <w:pStyle w:val="3"/>
-        <w:ind w:firstLine="480"/>
-      </w:pPr>
-      <w:bookmarkStart w:id="20" w:name="_Toc239798808"/>
-      <w:r>
-        <w:rPr>
-          <w:rFonts w:hint="eastAsia"/>
-          <w:noProof/>
-        </w:rPr>
-        <w:drawing>
-          <wp:inline distT="0" distB="0" distL="0" distR="0" wp14:anchorId="0A727CB9" wp14:editId="2C5F3C63">
-            <wp:extent cx="5274310" cy="6563360"/>
-            <wp:effectExtent l="0" t="0" r="2540" b="8890"/>
-            <wp:docPr id="1647211370" name="图片 6"/>
-            <wp:cNvGraphicFramePr>
-              <a:graphicFrameLocks xmlns:a="http://schemas.openxmlformats.org/drawingml/2006/main" noChangeAspect="1"/>
-            </wp:cNvGraphicFramePr>
-            <a:graphic xmlns:a="http://schemas.openxmlformats.org/drawingml/2006/main">
-              <a:graphicData uri="http://schemas.openxmlformats.org/drawingml/2006/picture">
-                <pic:pic xmlns:pic="http://schemas.openxmlformats.org/drawingml/2006/picture">
-                  <pic:nvPicPr>
-                    <pic:cNvPr id="0" name="Picture 12"/>
-                    <pic:cNvPicPr>
-                      <a:picLocks noChangeAspect="1" noChangeArrowheads="1"/>
-                    </pic:cNvPicPr>
-                  </pic:nvPicPr>
-                  <pic:blipFill>
-                    <a:blip r:embed="rId21" cstate="print">
-                      <a:extLst>
-                        <a:ext uri="{28A0092B-C50C-407E-A947-70E740481C1C}">
-                          <a14:useLocalDpi xmlns:a14="http://schemas.microsoft.com/office/drawing/2010/main" val="0"/>
-                        </a:ext>
-                      </a:extLst>
-                    </a:blip>
-                    <a:srcRect/>
-                    <a:stretch>
-                      <a:fillRect/>
-                    </a:stretch>
-                  </pic:blipFill>
-                  <pic:spPr bwMode="auto">
-                    <a:xfrm>
-                      <a:off x="0" y="0"/>
-                      <a:ext cx="5274310" cy="6563360"/>
-                    </a:xfrm>
-                    <a:prstGeom prst="rect">
-                      <a:avLst/>
-                    </a:prstGeom>
-                    <a:noFill/>
-                    <a:ln>
-                      <a:noFill/>
-                    </a:ln>
-                  </pic:spPr>
-                </pic:pic>
-              </a:graphicData>
-            </a:graphic>
-          </wp:inline>
-        </w:drawing>
-      </w:r>
-      <w:bookmarkEnd w:id="20"/>
-    </w:p>
-    <w:p>
-      <w:pPr>
-        <w:pStyle w:val="2"/>
-      </w:pPr>
-      <w:bookmarkStart w:id="21" w:name="_Toc239798809"/>
-      <w:r>
-        <w:t>2.</w:t>
-      </w:r>
-      <w:r>
-        <w:t>3</w:t>
-      </w:r>
-      <w:r>
-        <w:t xml:space="preserve"> </w:t>
-      </w:r>
-      <w:r>
-        <w:rPr>
-          <w:rFonts w:hint="eastAsia"/>
-        </w:rPr>
-        <w:t>软件需求的</w:t>
-      </w:r>
-      <w:r>
-        <w:t>分析类图</w:t>
-      </w:r>
-      <w:bookmarkEnd w:id="21"/>
-    </w:p>
-    <w:p>
-      <w:pPr>
-        <w:ind w:firstLine="480"/>
-        <w:rPr>
-          <w:rFonts w:ascii="仿宋_GB2312" w:eastAsia="仿宋_GB2312" w:cs="Times New Roman"/>
-          <w:color w:val="0070C0"/>
-          <w:szCs w:val="24"/>
-        </w:rPr>
-      </w:pPr>
-      <w:r>
-        <w:rPr>
-          <w:rFonts w:ascii="仿宋_GB2312" w:eastAsia="仿宋_GB2312" w:hint="eastAsia"/>
-          <w:szCs w:val="24"/>
-        </w:rPr>
-        <w:t xml:space="preserve">本分析类图将系统划分为边界类、控制类和实体类。边界类为旅客客户端界面，负责创建行程、更新位置、展示行程状态与行动卡片以及跳转地图导航；控制类包括行程服务、数据感知 </w:t>
-      </w:r>
-      <w:r>
-        <w:rPr>
-          <w:rFonts w:eastAsia="仿宋_GB2312" w:cs="Times New Roman"/>
-          <w:szCs w:val="24"/>
-        </w:rPr>
-        <w:t>Agent</w:t>
-      </w:r>
-      <w:r>
-        <w:rPr>
-          <w:rFonts w:ascii="仿宋_GB2312" w:eastAsia="仿宋_GB2312" w:hint="eastAsia"/>
-          <w:szCs w:val="24"/>
-        </w:rPr>
-        <w:t xml:space="preserve">、行动决策 </w:t>
-      </w:r>
-      <w:r>
-        <w:rPr>
-          <w:rFonts w:eastAsia="仿宋_GB2312" w:cs="Times New Roman"/>
-          <w:szCs w:val="24"/>
-        </w:rPr>
-        <w:t>Agent</w:t>
-      </w:r>
-      <w:r>
-        <w:rPr>
-          <w:rFonts w:ascii="仿宋_GB2312" w:eastAsia="仿宋_GB2312" w:hint="eastAsia"/>
-          <w:szCs w:val="24"/>
-        </w:rPr>
-        <w:t xml:space="preserve"> 和实时推送；实体类包</w:t>
-      </w:r>
-      <w:r>
-        <w:rPr>
-          <w:rFonts w:ascii="仿宋_GB2312" w:eastAsia="仿宋_GB2312" w:hint="eastAsia"/>
-          <w:szCs w:val="24"/>
-        </w:rPr>
-        <w:lastRenderedPageBreak/>
-        <w:t>括行程、行程状态与行动建议。数据感知</w:t>
-      </w:r>
-      <w:r>
-        <w:rPr>
-          <w:rFonts w:eastAsia="仿宋_GB2312" w:cs="Times New Roman"/>
-          <w:szCs w:val="24"/>
-        </w:rPr>
-        <w:t xml:space="preserve"> Agent</w:t>
-      </w:r>
-      <w:r>
-        <w:rPr>
-          <w:rFonts w:ascii="仿宋_GB2312" w:eastAsia="仿宋_GB2312" w:hint="eastAsia"/>
-          <w:szCs w:val="24"/>
-        </w:rPr>
-        <w:t xml:space="preserve"> 通过数据技能与工具获取航班、机场和路线数据并生成行程状态；行动决策</w:t>
-      </w:r>
-      <w:r>
-        <w:rPr>
-          <w:rFonts w:eastAsia="仿宋_GB2312" w:cs="Times New Roman"/>
-          <w:szCs w:val="24"/>
-        </w:rPr>
-        <w:t xml:space="preserve"> Agent</w:t>
-      </w:r>
-      <w:r>
-        <w:rPr>
-          <w:rFonts w:ascii="仿宋_GB2312" w:eastAsia="仿宋_GB2312" w:hint="eastAsia"/>
-          <w:szCs w:val="24"/>
-        </w:rPr>
-        <w:t xml:space="preserve"> 读取行程状态并生成行动建议；行程状态与行动建议被保存并返回客户端展示。系统分析类图如图</w:t>
-      </w:r>
-      <w:r>
-        <w:rPr>
-          <w:rFonts w:eastAsia="仿宋_GB2312" w:cs="Times New Roman"/>
-          <w:szCs w:val="24"/>
-        </w:rPr>
-        <w:t>2-7</w:t>
-      </w:r>
-      <w:r>
-        <w:rPr>
-          <w:rFonts w:ascii="仿宋_GB2312" w:eastAsia="仿宋_GB2312" w:hint="eastAsia"/>
-          <w:szCs w:val="24"/>
-        </w:rPr>
-        <w:t>所示。</w:t>
-      </w:r>
-    </w:p>
-    <w:p>
-      <w:pPr>
-        <w:keepNext/>
-        <w:spacing w:after="312"/>
-        <w:ind w:firstLine="480"/>
-        <w:jc w:val="center"/>
-      </w:pPr>
-    </w:p>
-    <w:p>
-      <w:bookmarkStart w:id="27" w:name="_Toc239798815"/>
-      <w:pPr>
-        <w:ind w:firstLine="480"/>
-      </w:pPr>
-      <w:r>
-        <w:rPr>
-          <w:rFonts w:hint="eastAsia"/>
-          <w:noProof/>
-        </w:rPr>
-        <w:drawing>
-          <wp:inline distT="0" distB="0" distL="0" distR="0" wp14:anchorId="305B802A" wp14:editId="1D58D601">
-            <wp:extent cx="5274310" cy="3333115"/>
-            <wp:effectExtent l="0" t="0" r="2540" b="635"/>
-            <wp:docPr id="326543812" name="图片 8"/>
-            <wp:cNvGraphicFramePr>
-              <a:graphicFrameLocks xmlns:a="http://schemas.openxmlformats.org/drawingml/2006/main" noChangeAspect="1"/>
-            </wp:cNvGraphicFramePr>
-            <a:graphic xmlns:a="http://schemas.openxmlformats.org/drawingml/2006/main">
-              <a:graphicData uri="http://schemas.openxmlformats.org/drawingml/2006/picture">
-                <pic:pic xmlns:pic="http://schemas.openxmlformats.org/drawingml/2006/picture">
-                  <pic:nvPicPr>
-                    <pic:cNvPr id="0" name="Picture 19"/>
-                    <pic:cNvPicPr>
-                      <a:picLocks noChangeAspect="1" noChangeArrowheads="1"/>
-                    </pic:cNvPicPr>
-                  </pic:nvPicPr>
-                  <pic:blipFill>
-                    <a:blip r:embed="rId22">
-                      <a:extLst>
-                        <a:ext uri="{28A0092B-C50C-407E-A947-70E740481C1C}">
-                          <a14:useLocalDpi xmlns:a14="http://schemas.microsoft.com/office/drawing/2010/main" val="0"/>
-                        </a:ext>
-                      </a:extLst>
-                    </a:blip>
-                    <a:srcRect/>
-                    <a:stretch>
-                      <a:fillRect/>
-                    </a:stretch>
-                  </pic:blipFill>
-                  <pic:spPr bwMode="auto">
-                    <a:xfrm>
-                      <a:off x="0" y="0"/>
-                      <a:ext cx="5274310" cy="3333115"/>
-                    </a:xfrm>
-                    <a:prstGeom prst="rect">
-                      <a:avLst/>
-                    </a:prstGeom>
-                    <a:noFill/>
-                    <a:ln>
-                      <a:noFill/>
-                    </a:ln>
-                  </pic:spPr>
-                </pic:pic>
-              </a:graphicData>
-            </a:graphic>
-          </wp:inline>
-        </w:drawing>
-      </w:r>
-      <w:r>
-        <w:t>图中各类与前述软件需求中的系统组件、数据对象和处理过程相对应。</w:t>
-      </w:r>
-      <w:bookmarkEnd w:id="27"/>
     </w:p>
     <w:p>
       <w:pPr>
         <w:pStyle w:val="1"/>
         <w:ind w:firstLine="883"/>
       </w:pPr>
-      <w:bookmarkStart w:id="22" w:name="_Toc239798810"/>
-      <w:bookmarkStart w:id="23" w:name="_Hlk118048548"/>
+      <w:bookmarkStart w:id="19" w:name="_Toc239798810"/>
+      <w:bookmarkStart w:id="20" w:name="_Hlk118048548"/>
       <w:r>
         <w:rPr>
           <w:rFonts w:hint="eastAsia"/>
         </w:rPr>
+        <w:lastRenderedPageBreak/>
         <w:t>第</w:t>
       </w:r>
       <w:r>
@@ -7564,13 +6562,13 @@
         </w:rPr>
         <w:t>其他需求描述</w:t>
       </w:r>
-      <w:bookmarkEnd w:id="22"/>
+      <w:bookmarkEnd w:id="19"/>
     </w:p>
     <w:p>
       <w:pPr>
         <w:pStyle w:val="2"/>
       </w:pPr>
-      <w:bookmarkStart w:id="24" w:name="_Toc239798811"/>
+      <w:bookmarkStart w:id="21" w:name="_Toc239798811"/>
       <w:r>
         <w:t>3</w:t>
       </w:r>
@@ -7592,7 +6590,7 @@
         </w:rPr>
         <w:t>性能要求</w:t>
       </w:r>
-      <w:bookmarkEnd w:id="24"/>
+      <w:bookmarkEnd w:id="21"/>
     </w:p>
     <w:p>
       <w:pPr>
@@ -7649,15 +6647,7 @@
           <w:rFonts w:ascii="仿宋_GB2312" w:eastAsia="仿宋_GB2312" w:hint="eastAsia"/>
           <w:szCs w:val="24"/>
         </w:rPr>
-        <w:t>3). 可靠性要求：外部接口不可用、定位失败或网络中断时，系统应继续运</w:t>
-      </w:r>
-      <w:r>
-        <w:rPr>
-          <w:rFonts w:ascii="仿宋_GB2312" w:eastAsia="仿宋_GB2312" w:hint="eastAsia"/>
-          <w:szCs w:val="24"/>
-        </w:rPr>
-        <w:lastRenderedPageBreak/>
-        <w:t>行，使用最近一次有效数据降级，并明确显示数据失效或降级提示，不输出无依据的确定性结论；课程演示场景下可支持多名旅客同时使用。</w:t>
+        <w:t>3). 可靠性要求：外部接口不可用、定位失败或网络中断时，系统应继续运行，使用最近一次有效数据降级，并明确显示数据失效或降级提示，不输出无依据的确定性结论；课程演示场景下可支持多名旅客同时使用。</w:t>
       </w:r>
     </w:p>
     <w:p>
@@ -7681,7 +6671,7 @@
       <w:pPr>
         <w:pStyle w:val="2"/>
       </w:pPr>
-      <w:bookmarkStart w:id="25" w:name="_Toc239798812"/>
+      <w:bookmarkStart w:id="22" w:name="_Toc239798812"/>
       <w:r>
         <w:t>3</w:t>
       </w:r>
@@ -7703,7 +6693,7 @@
         </w:rPr>
         <w:t>交付要求</w:t>
       </w:r>
-      <w:bookmarkEnd w:id="25"/>
+      <w:bookmarkEnd w:id="22"/>
     </w:p>
     <w:p>
       <w:pPr>
@@ -7714,21 +6704,12 @@
           <w:szCs w:val="24"/>
         </w:rPr>
       </w:pPr>
-      <w:proofErr w:type="gramStart"/>
-      <w:r>
-        <w:rPr>
-          <w:rFonts w:ascii="仿宋_GB2312" w:eastAsia="仿宋_GB2312" w:hint="eastAsia"/>
-          <w:szCs w:val="24"/>
-        </w:rPr>
-        <w:t>1）.</w:t>
-      </w:r>
-      <w:proofErr w:type="gramEnd"/>
-      <w:r>
-        <w:rPr>
-          <w:rFonts w:ascii="仿宋_GB2312" w:eastAsia="仿宋_GB2312" w:hint="eastAsia"/>
-          <w:szCs w:val="24"/>
-        </w:rPr>
-        <w:t xml:space="preserve"> 系统客户端与云端服务端源代码；</w:t>
+      <w:r>
+        <w:rPr>
+          <w:rFonts w:ascii="仿宋_GB2312" w:eastAsia="仿宋_GB2312" w:hint="eastAsia"/>
+          <w:szCs w:val="24"/>
+        </w:rPr>
+        <w:t>1）. 系统客户端与云端服务端源代码；</w:t>
       </w:r>
     </w:p>
     <w:p>
@@ -7769,8 +6750,9 @@
       <w:pPr>
         <w:pStyle w:val="2"/>
       </w:pPr>
-      <w:bookmarkStart w:id="26" w:name="_Toc239798813"/>
-      <w:r>
+      <w:bookmarkStart w:id="23" w:name="_Toc239798813"/>
+      <w:r>
+        <w:lastRenderedPageBreak/>
         <w:t>3.3</w:t>
       </w:r>
       <w:r>
@@ -7782,7 +6764,7 @@
         </w:rPr>
         <w:t>验收要求</w:t>
       </w:r>
-      <w:bookmarkEnd w:id="26"/>
+      <w:bookmarkEnd w:id="23"/>
     </w:p>
     <w:p>
       <w:pPr>
@@ -7832,7 +6814,7 @@
         <w:t xml:space="preserve"> 获取或查询航班、机场、路线与旅客位置等相关数据，并形成当前行程状态。</w:t>
       </w:r>
     </w:p>
-    <w:bookmarkEnd w:id="23"/>
+    <w:bookmarkEnd w:id="20"/>
     <w:p>
       <w:pPr>
         <w:ind w:firstLine="480"/>
@@ -7912,8 +6894,8 @@
       </w:r>
     </w:p>
     <w:sectPr>
-      <w:footerReference w:type="default" r:id="rId23"/>
-      <w:footerReference w:type="first" r:id="rId24"/>
+      <w:footerReference w:type="default" r:id="rId19"/>
+      <w:footerReference w:type="first" r:id="rId20"/>
       <w:pgSz w:w="11906" w:h="16838"/>
       <w:pgMar w:top="1440" w:right="1800" w:bottom="1440" w:left="1800" w:header="851" w:footer="992" w:gutter="0"/>
       <w:pgNumType w:start="1"/>

</xml_diff>